<commit_message>
Fix VKR DOCX pagination and heading breaks
</commit_message>
<xml_diff>
--- a/docs/ГК_Ресурс_ВКР.docx
+++ b/docs/ГК_Ресурс_ВКР.docx
@@ -215,15 +215,9 @@
         <w:ind w:firstLine="0"/>
       </w:pPr>
       <w:r>
-        <w:rPr>
-          <w:color w:val="000000"/>
-        </w:rPr>
         <w:t>ВВЕДЕНИЕ</w:t>
       </w:r>
       <w:r>
-        <w:rPr>
-          <w:color w:val="000000"/>
-        </w:rPr>
         <w:tab/>
         <w:t>3</w:t>
       </w:r>
@@ -237,15 +231,9 @@
         <w:ind w:firstLine="0"/>
       </w:pPr>
       <w:r>
-        <w:rPr>
-          <w:color w:val="000000"/>
-        </w:rPr>
         <w:t>ГЛАВА 1. ПРОЕКТНАЯ ПРОБЛЕМА</w:t>
       </w:r>
       <w:r>
-        <w:rPr>
-          <w:color w:val="000000"/>
-        </w:rPr>
         <w:tab/>
         <w:t>6</w:t>
       </w:r>
@@ -259,17 +247,11 @@
         <w:ind w:left="425" w:firstLine="0"/>
       </w:pPr>
       <w:r>
-        <w:rPr>
-          <w:color w:val="000000"/>
-        </w:rPr>
         <w:t>1.1. Декомпозиция финансово-хозяйственной деятельности и динамики продаж ГК «Ресурс»</w:t>
       </w:r>
       <w:r>
-        <w:rPr>
-          <w:color w:val="000000"/>
-        </w:rPr>
         <w:tab/>
-        <w:t>7</w:t>
+        <w:t>6</w:t>
       </w:r>
     </w:p>
     <w:p>
@@ -281,17 +263,11 @@
         <w:ind w:left="425" w:firstLine="0"/>
       </w:pPr>
       <w:r>
-        <w:rPr>
-          <w:color w:val="000000"/>
-        </w:rPr>
         <w:t>1.2. Влияние ипотечного и регионального контекста на спрос</w:t>
       </w:r>
       <w:r>
-        <w:rPr>
-          <w:color w:val="000000"/>
-        </w:rPr>
         <w:tab/>
-        <w:t>9</w:t>
+        <w:t>7</w:t>
       </w:r>
     </w:p>
     <w:p>
@@ -303,17 +279,11 @@
         <w:ind w:left="425" w:firstLine="0"/>
       </w:pPr>
       <w:r>
-        <w:rPr>
-          <w:color w:val="000000"/>
-        </w:rPr>
         <w:t>1.3. Маркетинговая эффективность и ограничения прямой лидогенерации</w:t>
       </w:r>
       <w:r>
-        <w:rPr>
-          <w:color w:val="000000"/>
-        </w:rPr>
         <w:tab/>
-        <w:t>10</w:t>
+        <w:t>8</w:t>
       </w:r>
     </w:p>
     <w:p>
@@ -325,17 +295,11 @@
         <w:ind w:left="425" w:firstLine="0"/>
       </w:pPr>
       <w:r>
-        <w:rPr>
-          <w:color w:val="000000"/>
-        </w:rPr>
         <w:t>1.4. Технологические барьеры CRM-архитектуры</w:t>
       </w:r>
       <w:r>
-        <w:rPr>
-          <w:color w:val="000000"/>
-        </w:rPr>
         <w:tab/>
-        <w:t>11</w:t>
+        <w:t>9</w:t>
       </w:r>
     </w:p>
     <w:p>
@@ -347,17 +311,11 @@
         <w:ind w:left="425" w:firstLine="0"/>
       </w:pPr>
       <w:r>
-        <w:rPr>
-          <w:color w:val="000000"/>
-        </w:rPr>
         <w:t>1.5. Формулировка проектной проблемы и гипотезы решения</w:t>
       </w:r>
       <w:r>
-        <w:rPr>
-          <w:color w:val="000000"/>
-        </w:rPr>
         <w:tab/>
-        <w:t>12</w:t>
+        <w:t>10</w:t>
       </w:r>
     </w:p>
     <w:p>
@@ -369,17 +327,11 @@
         <w:ind w:firstLine="0"/>
       </w:pPr>
       <w:r>
-        <w:rPr>
-          <w:color w:val="000000"/>
-        </w:rPr>
         <w:t>ГЛАВА 2. АНАЛИТИЧЕСКОЕ ОБОСНОВАНИЕ ПРОЕКТА</w:t>
       </w:r>
       <w:r>
-        <w:rPr>
-          <w:color w:val="000000"/>
-        </w:rPr>
         <w:tab/>
-        <w:t>14</w:t>
+        <w:t>12</w:t>
       </w:r>
     </w:p>
     <w:p>
@@ -391,17 +343,11 @@
         <w:ind w:left="425" w:firstLine="0"/>
       </w:pPr>
       <w:r>
-        <w:rPr>
-          <w:color w:val="000000"/>
-        </w:rPr>
         <w:t>2.1. Макроэкономический и региональный анализ рынка жилищного строительства</w:t>
       </w:r>
       <w:r>
-        <w:rPr>
-          <w:color w:val="000000"/>
-        </w:rPr>
         <w:tab/>
-        <w:t>15</w:t>
+        <w:t>12</w:t>
       </w:r>
     </w:p>
     <w:p>
@@ -413,17 +359,11 @@
         <w:ind w:left="425" w:firstLine="0"/>
       </w:pPr>
       <w:r>
-        <w:rPr>
-          <w:color w:val="000000"/>
-        </w:rPr>
         <w:t>2.2. Расчет рыночного потенциала по модели TAM-SAM-SOM</w:t>
       </w:r>
       <w:r>
-        <w:rPr>
-          <w:color w:val="000000"/>
-        </w:rPr>
         <w:tab/>
-        <w:t>17</w:t>
+        <w:t>13</w:t>
       </w:r>
     </w:p>
     <w:p>
@@ -435,17 +375,11 @@
         <w:ind w:left="425" w:firstLine="0"/>
       </w:pPr>
       <w:r>
-        <w:rPr>
-          <w:color w:val="000000"/>
-        </w:rPr>
         <w:t>2.3. Когортный анализ продаж объектов ГК «Ресурс»</w:t>
       </w:r>
       <w:r>
-        <w:rPr>
-          <w:color w:val="000000"/>
-        </w:rPr>
         <w:tab/>
-        <w:t>19</w:t>
+        <w:t>14</w:t>
       </w:r>
     </w:p>
     <w:p>
@@ -457,17 +391,11 @@
         <w:ind w:left="425" w:firstLine="0"/>
       </w:pPr>
       <w:r>
-        <w:rPr>
-          <w:color w:val="000000"/>
-        </w:rPr>
         <w:t>2.4. SWOT- и PESTEL-анализ</w:t>
       </w:r>
       <w:r>
-        <w:rPr>
-          <w:color w:val="000000"/>
-        </w:rPr>
         <w:tab/>
-        <w:t>20</w:t>
+        <w:t>15</w:t>
       </w:r>
     </w:p>
     <w:p>
@@ -479,17 +407,11 @@
         <w:ind w:left="425" w:firstLine="0"/>
       </w:pPr>
       <w:r>
-        <w:rPr>
-          <w:color w:val="000000"/>
-        </w:rPr>
         <w:t>2.5. Обоснование стратегии цифровизации агентского канала</w:t>
       </w:r>
       <w:r>
-        <w:rPr>
-          <w:color w:val="000000"/>
-        </w:rPr>
         <w:tab/>
-        <w:t>22</w:t>
+        <w:t>17</w:t>
       </w:r>
     </w:p>
     <w:p>
@@ -501,17 +423,11 @@
         <w:ind w:firstLine="0"/>
       </w:pPr>
       <w:r>
-        <w:rPr>
-          <w:color w:val="000000"/>
-        </w:rPr>
         <w:t>ГЛАВА 3. ПРОЕКТИРОВАНИЕ ЦИФРОВОЙ ЭКОСИСТЕМЫ И ПЛАН ВНЕДРЕНИЯ</w:t>
       </w:r>
       <w:r>
-        <w:rPr>
-          <w:color w:val="000000"/>
-        </w:rPr>
         <w:tab/>
-        <w:t>23</w:t>
+        <w:t>19</w:t>
       </w:r>
     </w:p>
     <w:p>
@@ -523,17 +439,11 @@
         <w:ind w:left="425" w:firstLine="0"/>
       </w:pPr>
       <w:r>
-        <w:rPr>
-          <w:color w:val="000000"/>
-        </w:rPr>
         <w:t>3.1. Обзор инструментов рынка и выбор решения</w:t>
       </w:r>
       <w:r>
-        <w:rPr>
-          <w:color w:val="000000"/>
-        </w:rPr>
         <w:tab/>
-        <w:t>24</w:t>
+        <w:t>19</w:t>
       </w:r>
     </w:p>
     <w:p>
@@ -543,19 +453,16 @@
         </w:tabs>
         <w:spacing w:line="276" w:lineRule="auto"/>
         <w:ind w:left="425" w:firstLine="0"/>
-      </w:pPr>
-      <w:r>
-        <w:rPr>
-          <w:color w:val="000000"/>
-        </w:rPr>
+        <w:rPr>
+          <w:lang w:val="en-US"/>
+        </w:rPr>
+      </w:pPr>
+      <w:r>
         <w:t>3.2. Концепция B2B AI SaaS-портала Resource Partner AI</w:t>
       </w:r>
       <w:r>
-        <w:rPr>
-          <w:color w:val="000000"/>
-        </w:rPr>
         <w:tab/>
-        <w:t>27</w:t>
+        <w:t>21</w:t>
       </w:r>
     </w:p>
     <w:p>
@@ -567,17 +474,11 @@
         <w:ind w:left="425" w:firstLine="0"/>
       </w:pPr>
       <w:r>
-        <w:rPr>
-          <w:color w:val="000000"/>
-        </w:rPr>
         <w:t>3.3. Функциональная и техническая архитектура MVP</w:t>
       </w:r>
       <w:r>
-        <w:rPr>
-          <w:color w:val="000000"/>
-        </w:rPr>
         <w:tab/>
-        <w:t>29</w:t>
+        <w:t>23</w:t>
       </w:r>
     </w:p>
     <w:p>
@@ -589,17 +490,11 @@
         <w:ind w:left="425" w:firstLine="0"/>
       </w:pPr>
       <w:r>
-        <w:rPr>
-          <w:color w:val="000000"/>
-        </w:rPr>
         <w:t>3.4. Реинжиниринг бизнес-процессов агентских продаж</w:t>
       </w:r>
       <w:r>
-        <w:rPr>
-          <w:color w:val="000000"/>
-        </w:rPr>
         <w:tab/>
-        <w:t>31</w:t>
+        <w:t>24</w:t>
       </w:r>
     </w:p>
     <w:p>
@@ -611,17 +506,11 @@
         <w:ind w:left="425" w:firstLine="0"/>
       </w:pPr>
       <w:r>
-        <w:rPr>
-          <w:color w:val="000000"/>
-        </w:rPr>
         <w:t>3.5. План внедрения и диаграмма Ганта</w:t>
       </w:r>
       <w:r>
-        <w:rPr>
-          <w:color w:val="000000"/>
-        </w:rPr>
         <w:tab/>
-        <w:t>33</w:t>
+        <w:t>26</w:t>
       </w:r>
     </w:p>
     <w:p>
@@ -633,17 +522,11 @@
         <w:ind w:left="425" w:firstLine="0"/>
       </w:pPr>
       <w:r>
-        <w:rPr>
-          <w:color w:val="000000"/>
-        </w:rPr>
         <w:t>3.6. Ожидаемые результаты внедрения и экономический эффект</w:t>
       </w:r>
       <w:r>
-        <w:rPr>
-          <w:color w:val="000000"/>
-        </w:rPr>
         <w:tab/>
-        <w:t>35</w:t>
+        <w:t>27</w:t>
       </w:r>
     </w:p>
     <w:p>
@@ -655,17 +538,11 @@
         <w:ind w:left="425" w:firstLine="0"/>
       </w:pPr>
       <w:r>
-        <w:rPr>
-          <w:color w:val="000000"/>
-        </w:rPr>
         <w:t>3.7. MVP Resource Partner AI для демонстрации на защите</w:t>
       </w:r>
       <w:r>
-        <w:rPr>
-          <w:color w:val="000000"/>
-        </w:rPr>
         <w:tab/>
-        <w:t>37</w:t>
+        <w:t>29</w:t>
       </w:r>
     </w:p>
     <w:p>
@@ -677,17 +554,11 @@
         <w:ind w:firstLine="0"/>
       </w:pPr>
       <w:r>
-        <w:rPr>
-          <w:color w:val="000000"/>
-        </w:rPr>
         <w:t>ЗАКЛЮЧЕНИЕ</w:t>
       </w:r>
       <w:r>
-        <w:rPr>
-          <w:color w:val="000000"/>
-        </w:rPr>
         <w:tab/>
-        <w:t>39</w:t>
+        <w:t>31</w:t>
       </w:r>
     </w:p>
     <w:p>
@@ -699,17 +570,11 @@
         <w:ind w:firstLine="0"/>
       </w:pPr>
       <w:r>
-        <w:rPr>
-          <w:color w:val="000000"/>
-        </w:rPr>
         <w:t>СПИСОК ИСПОЛЬЗОВАННЫХ ИСТОЧНИКОВ</w:t>
       </w:r>
       <w:r>
-        <w:rPr>
-          <w:color w:val="000000"/>
-        </w:rPr>
         <w:tab/>
-        <w:t>41</w:t>
+        <w:t>33</w:t>
       </w:r>
     </w:p>
     <w:p>
@@ -721,17 +586,11 @@
         <w:ind w:firstLine="0"/>
       </w:pPr>
       <w:r>
-        <w:rPr>
-          <w:color w:val="000000"/>
-        </w:rPr>
         <w:t>ПРИЛОЖЕНИЕ А. Описание MVP Resource Partner AI</w:t>
       </w:r>
       <w:r>
-        <w:rPr>
-          <w:color w:val="000000"/>
-        </w:rPr>
         <w:tab/>
-        <w:t>43</w:t>
+        <w:t>35</w:t>
       </w:r>
     </w:p>
     <w:p>
@@ -743,17 +602,11 @@
         <w:ind w:firstLine="0"/>
       </w:pPr>
       <w:r>
-        <w:rPr>
-          <w:color w:val="000000"/>
-        </w:rPr>
         <w:t>ПРИЛОЖЕНИЕ Б. Карта редакционных правок по выделенным фрагментам</w:t>
       </w:r>
       <w:r>
-        <w:rPr>
-          <w:color w:val="000000"/>
-        </w:rPr>
         <w:tab/>
-        <w:t>44</w:t>
+        <w:t>36</w:t>
       </w:r>
     </w:p>
     <w:p>
@@ -775,41 +628,23 @@
         <w:rPr>
           <w:color w:val="000000"/>
         </w:rPr>
-        <w:t>Актуальность темы исследования определяется изменением условий продажи первичной недвижимости в 2024-2026 гг. Массовая льготная ипотека на новостройки была завершена 1 июля 2024 г., а решение Банка России от 25 октября 2024 г. установило с 28 октября 2024 г. ключевую ставку на уровне 21,00% годовых [3; 4]. В результате для девелоперов регионального уровня усилилось давление сразу по нескольким направлениям: снизилась доступность ипотечного кредита, вырос срок принятия решения покупателем, увеличилась стоимо</w:t>
-      </w:r>
-      <w:r>
-        <w:rPr>
-          <w:color w:val="000000"/>
-        </w:rPr>
-        <w:t>сть прямой лидогенерации и возросла роль профессиональных посредников.</w:t>
-      </w:r>
-    </w:p>
-    <w:p>
-      <w:r>
-        <w:rPr>
-          <w:color w:val="000000"/>
-        </w:rPr>
-        <w:t xml:space="preserve">Для ГК «Ресурс» данные изменения проявились особенно заметно. По внутренней управленческой отчетности компании за 2023-2025 гг. продажи в 2025 г. сократились до 606,4 млн руб., тогда как в 2024 г. выручка составляла 981,8 млн руб. Одновременно доля сделок с участием риелторов достигла 77,5%, а по объектам бизнес-класса агентский канал фактически стал ключевым способом доступа к платежеспособному спросу [13; 14]. Следовательно, конкурентоспособность компании зависит не только от характеристик продукта, но и </w:t>
-      </w:r>
-      <w:r>
-        <w:rPr>
-          <w:color w:val="000000"/>
-        </w:rPr>
-        <w:t>от качества цифрового взаимодействия с партнерской сетью.</w:t>
-      </w:r>
-    </w:p>
-    <w:p>
-      <w:r>
-        <w:rPr>
-          <w:color w:val="000000"/>
-        </w:rPr>
-        <w:t>Дополнительную актуальность теме придает распространение цифровых платформ, API-интеграций и решений искусственного интеллекта в корпоративных продажах. Национальная стратегия развития искусственного интеллекта, актуализированная Указом Президента РФ от 15.02.2024 № 124, закрепляет значимость внедрения ИИ-технологий в отраслях экономики [5]. Для рынка недвижимости это означает переход от разрозненных CRM-процессов к B2B AI SaaS-решениям: партнерским кабинетам, автоматической защите сделки, интеллектуальному</w:t>
-      </w:r>
-      <w:r>
-        <w:rPr>
-          <w:color w:val="000000"/>
-        </w:rPr>
-        <w:t xml:space="preserve"> подбору лотов, аналитике KPI и персонализированным рекомендациям для агентств.</w:t>
+        <w:t>Актуальность темы исследования определяется изменением условий продажи первичной недвижимости в 2024-2026 гг. Массовая льготная ипотека на новостройки была завершена 1 июля 2024 г., а решение Банка России от 25 октября 2024 г. установило с 28 октября 2024 г. ключевую ставку на уровне 21,00% годовых [3; 4]. В результате для девелоперов регионального уровня усилилось давление сразу по нескольким направлениям: снизилась доступность ипотечного кредита, вырос срок принятия решения покупателем, увеличилась стоимость прямой лидогенерации и возросла роль профессиональных посредников.</w:t>
+      </w:r>
+    </w:p>
+    <w:p>
+      <w:r>
+        <w:rPr>
+          <w:color w:val="000000"/>
+        </w:rPr>
+        <w:t>Для ГК «Ресурс» данные изменения проявились особенно заметно. По внутренней управленческой отчетности компании за 2023-2025 гг. продажи в 2025 г. сократились до 606,4 млн руб., тогда как в 2024 г. выручка составляла 981,8 млн руб. Одновременно доля сделок с участием риелторов достигла 77,5%, а по объектам бизнес-класса агентский канал фактически стал ключевым способом доступа к платежеспособному спросу [13; 14]. Следовательно, конкурентоспособность компании зависит не только от характеристик продукта, но и от качества цифрового взаимодействия с партнерской сетью.</w:t>
+      </w:r>
+    </w:p>
+    <w:p>
+      <w:r>
+        <w:rPr>
+          <w:color w:val="000000"/>
+        </w:rPr>
+        <w:t>Дополнительную актуальность теме придает распространение цифровых платформ, API-интеграций и решений искусственного интеллекта в корпоративных продажах. Национальная стратегия развития искусственного интеллекта, актуализированная Указом Президента РФ от 15.02.2024 № 124, закрепляет значимость внедрения ИИ-технологий в отраслях экономики [5]. Для рынка недвижимости это означает переход от разрозненных CRM-процессов к B2B AI SaaS-решениям: партнерским кабинетам, автоматической защите сделки, интеллектуальному подбору лотов, аналитике KPI и персонализированным рекомендациям для агентств.</w:t>
       </w:r>
     </w:p>
     <w:p>
@@ -818,13 +653,7 @@
           <w:color w:val="000000"/>
         </w:rPr>
         <w:lastRenderedPageBreak/>
-        <w:t>Проблема исследования состоит в несоответствии текущей системы продаж ГК «Ресурс» новой структуре спроса. В компании используются Bitrix24 и Profitbase, однако риелторы остаются вне цифрового контура: бронирование и согласование лотов ведутся через менеджеров и мессенджеры, данные о статусах квартир не всегда доступны в моменте, а контроль эффективности агентств требует ручной консолидации информации. При высокой доле партнерских продаж такая модель приводит к потерям времени, перегрузке отдела продаж и рис</w:t>
-      </w:r>
-      <w:r>
-        <w:rPr>
-          <w:color w:val="000000"/>
-        </w:rPr>
-        <w:t>ку ухода агентов к более технологичным конкурентам.</w:t>
+        <w:t>Проблема исследования состоит в несоответствии текущей системы продаж ГК «Ресурс» новой структуре спроса. В компании используются Bitrix24 и Profitbase, однако риелторы остаются вне цифрового контура: бронирование и согласование лотов ведутся через менеджеров и мессенджеры, данные о статусах квартир не всегда доступны в моменте, а контроль эффективности агентств требует ручной консолидации информации. При высокой доле партнерских продаж такая модель приводит к потерям времени, перегрузке отдела продаж и риску ухода агентов к более технологичным конкурентам.</w:t>
       </w:r>
     </w:p>
     <w:p>
@@ -840,13 +669,7 @@
         <w:rPr>
           <w:color w:val="000000"/>
         </w:rPr>
-        <w:t>Для достижения цели поставлены следующие задачи: проанализировать финансово-хозяйственную динамику ГК «Ресурс» за 2023-2025 гг.; оценить влияние макроэкономических факторов и регионального рынка на продажи компании; рассчитать рыночный потенциал по модели TAM-SAM-SOM; выявить ограничения действующей CRM-архитектуры; провести SWOT- и PESTEL-анализ; сравнить доступные цифровые инструменты для девелопера; обосновать выбор B2B AI SaaS-подхода; разработать функциональную архитектуру портала, план внедрения и ожи</w:t>
-      </w:r>
-      <w:r>
-        <w:rPr>
-          <w:color w:val="000000"/>
-        </w:rPr>
-        <w:t>даемые показатели результата.</w:t>
+        <w:t>Для достижения цели поставлены следующие задачи: проанализировать финансово-хозяйственную динамику ГК «Ресурс» за 2023-2025 гг.; оценить влияние макроэкономических факторов и регионального рынка на продажи компании; рассчитать рыночный потенциал по модели TAM-SAM-SOM; выявить ограничения действующей CRM-архитектуры; провести SWOT- и PESTEL-анализ; сравнить доступные цифровые инструменты для девелопера; обосновать выбор B2B AI SaaS-подхода; разработать функциональную архитектуру портала, план внедрения и ожидаемые показатели результата.</w:t>
       </w:r>
     </w:p>
     <w:p>
@@ -902,7 +725,6 @@
         <w:pStyle w:val="21"/>
       </w:pPr>
       <w:r>
-        <w:lastRenderedPageBreak/>
         <w:t>1.1. Декомпозиция финансово-хозяйственной деятельности и динамики продаж ГК «Ресурс»</w:t>
       </w:r>
     </w:p>
@@ -911,13 +733,7 @@
         <w:rPr>
           <w:color w:val="000000"/>
         </w:rPr>
-        <w:t>ГК «Ресурс» является региональным девелопером, реализующим жилые проекты в г. Ижевске и Удмуртской Республике. Особенность компании состоит в сочетании объектов массового сегмента и более маржинального продукта бизнес-класса. Такая структура портфеля позволяет работать с разными группами покупателей, но одновременно повышает чувствительность к макроэкономическим изменениям: массовый сегмент сильнее зависит от ипотечной доступности, а бизнес-класс - от качества консультационной продажи и доверия к застройщик</w:t>
-      </w:r>
-      <w:r>
-        <w:rPr>
-          <w:color w:val="000000"/>
-        </w:rPr>
-        <w:t>у.</w:t>
+        <w:t>ГК «Ресурс» является региональным девелопером, реализующим жилые проекты в г. Ижевске и Удмуртской Республике. Особенность компании состоит в сочетании объектов массового сегмента и более маржинального продукта бизнес-класса. Такая структура портфеля позволяет работать с разными группами покупателей, но одновременно повышает чувствительность к макроэкономическим изменениям: массовый сегмент сильнее зависит от ипотечной доступности, а бизнес-класс - от качества консультационной продажи и доверия к застройщику.</w:t>
       </w:r>
     </w:p>
     <w:p>
@@ -1081,6 +897,7 @@
                 <w:color w:val="000000"/>
                 <w:sz w:val="24"/>
               </w:rPr>
+              <w:lastRenderedPageBreak/>
               <w:t>Выручка от продаж, млн руб.</w:t>
             </w:r>
           </w:p>
@@ -1153,15 +970,7 @@
                 <w:color w:val="000000"/>
                 <w:sz w:val="24"/>
               </w:rPr>
-              <w:t xml:space="preserve">После пика 2024 г. </w:t>
-            </w:r>
-            <w:r>
-              <w:rPr>
-                <w:color w:val="000000"/>
-                <w:sz w:val="24"/>
-              </w:rPr>
-              <w:lastRenderedPageBreak/>
-              <w:t>фиксируется структурное снижение продаж.</w:t>
+              <w:t>После пика 2024 г. фиксируется структурное снижение продаж.</w:t>
             </w:r>
           </w:p>
         </w:tc>
@@ -1184,7 +993,6 @@
                 <w:color w:val="000000"/>
                 <w:sz w:val="24"/>
               </w:rPr>
-              <w:lastRenderedPageBreak/>
               <w:t>Доля ипотечных сделок</w:t>
             </w:r>
           </w:p>
@@ -1459,23 +1267,23 @@
         <w:pStyle w:val="21"/>
       </w:pPr>
       <w:r>
+        <w:t>1.2. Влияние ипотечного и регионального контекста на спрос</w:t>
+      </w:r>
+    </w:p>
+    <w:p>
+      <w:r>
+        <w:rPr>
+          <w:color w:val="000000"/>
+        </w:rPr>
+        <w:t>Завершение массовой программы льготной ипотеки под 8% изменило структуру спроса на первичное жилье. Согласно информации ДОМ.РФ, заключить кредитный договор по данной программе было возможно до 1 июля 2024 г. включительно [4]. После завершения программы покупатель стал чаще сопоставлять стоимость владения жильем, размер первоначального взноса и альтернативные способы размещения капитала.</w:t>
+      </w:r>
+    </w:p>
+    <w:p>
+      <w:r>
+        <w:rPr>
+          <w:color w:val="000000"/>
+        </w:rPr>
         <w:lastRenderedPageBreak/>
-        <w:t>1.2. Влияние ипотечного и регионального контекста на спрос</w:t>
-      </w:r>
-    </w:p>
-    <w:p>
-      <w:r>
-        <w:rPr>
-          <w:color w:val="000000"/>
-        </w:rPr>
-        <w:t>Завершение массовой программы льготной ипотеки под 8% изменило структуру спроса на первичное жилье. Согласно информации ДОМ.РФ, заключить кредитный договор по данной программе было возможно до 1 июля 2024 г. включительно [4]. После завершения программы покупатель стал чаще сопоставлять стоимость владения жильем, размер первоначального взноса и альтернативные способы размещения капитала.</w:t>
-      </w:r>
-    </w:p>
-    <w:p>
-      <w:r>
-        <w:rPr>
-          <w:color w:val="000000"/>
-        </w:rPr>
         <w:t>Высокая ключевая ставка Банка России усилила этот эффект. С 28 октября 2024 г. ключевая ставка была установлена на уровне 21,00% годовых [3]. Для девелопера это означает не только падение доступности ипотечных платежей для конечного покупателя, но и более жесткие требования к скорости реализации лотов, управлению складом и точности маркетинговых затрат.</w:t>
       </w:r>
     </w:p>
@@ -1500,24 +1308,30 @@
         <w:pStyle w:val="21"/>
       </w:pPr>
       <w:r>
+        <w:t>1.3. Маркетинговая эффективность и ограничения прямой лидогенерации</w:t>
+      </w:r>
+    </w:p>
+    <w:p>
+      <w:r>
+        <w:rPr>
+          <w:color w:val="000000"/>
+        </w:rPr>
+        <w:t>Анализ маркетинговой воронки ГК «Ресурс» показывает снижение результативности прямой digital-рекламы. По данным Bitrix24 за 2025 г., в CRM поступило 5858 лидов, из которых 546 перешли в стадию сделки, а 124 завершились успешной продажей. Совокупная конверсия в продажу составила 2,11% [14].</w:t>
+      </w:r>
+    </w:p>
+    <w:p>
+      <w:r>
+        <w:rPr>
+          <w:color w:val="000000"/>
+        </w:rPr>
+        <w:t xml:space="preserve">Особенно значимым является показатель стоимости привлечения покупателя по объекту ЖК «Lighthouse». В 2024 г. CAC для данного проекта достигал 383,6 тыс. руб. При такой стоимости прямой лид становится сопоставимым с агентским вознаграждением, однако в отличие от комиссии </w:t>
+      </w:r>
+      <w:r>
+        <w:rPr>
+          <w:color w:val="000000"/>
+        </w:rPr>
         <w:lastRenderedPageBreak/>
-        <w:t>1.3. Маркетинговая эффективность и ограничения прямой лидогенерации</w:t>
-      </w:r>
-    </w:p>
-    <w:p>
-      <w:r>
-        <w:rPr>
-          <w:color w:val="000000"/>
-        </w:rPr>
-        <w:t>Анализ маркетинговой воронки ГК «Ресурс» показывает снижение результативности прямой digital-рекламы. По данным Bitrix24 за 2025 г., в CRM поступило 5858 лидов, из которых 546 перешли в стадию сделки, а 124 завершились успешной продажей. Совокупная конверсия в продажу составила 2,11% [14].</w:t>
-      </w:r>
-    </w:p>
-    <w:p>
-      <w:r>
-        <w:rPr>
-          <w:color w:val="000000"/>
-        </w:rPr>
-        <w:t>Особенно значимым является показатель стоимости привлечения покупателя по объекту ЖК «Lighthouse». В 2024 г. CAC для данного проекта достигал 383,6 тыс. руб. При такой стоимости прямой лид становится сопоставимым с агентским вознаграждением, однако в отличие от комиссии риелтора рекламный бюджет оплачивается авансом и не гарантирует заключения сделки.</w:t>
+        <w:t>риелтора рекламный бюджет оплачивается авансом и не гарантирует заключения сделки.</w:t>
       </w:r>
     </w:p>
     <w:p>
@@ -1533,7 +1347,6 @@
         <w:pStyle w:val="21"/>
       </w:pPr>
       <w:r>
-        <w:lastRenderedPageBreak/>
         <w:t>1.4. Технологические барьеры CRM-архитектуры</w:t>
       </w:r>
     </w:p>
@@ -1932,7 +1745,6 @@
         <w:pStyle w:val="21"/>
       </w:pPr>
       <w:r>
-        <w:lastRenderedPageBreak/>
         <w:t>2.1. Макроэкономический и региональный анализ рынка жилищного строительства</w:t>
       </w:r>
     </w:p>
@@ -2124,6 +1936,7 @@
                 <w:color w:val="000000"/>
                 <w:sz w:val="24"/>
               </w:rPr>
+              <w:lastRenderedPageBreak/>
               <w:t>Изменение господдержки</w:t>
             </w:r>
           </w:p>
@@ -2183,7 +1996,6 @@
                 <w:color w:val="000000"/>
                 <w:sz w:val="24"/>
               </w:rPr>
-              <w:lastRenderedPageBreak/>
               <w:t>Конкуренция девелоперов</w:t>
             </w:r>
           </w:p>
@@ -2350,31 +2162,31 @@
         <w:pStyle w:val="21"/>
       </w:pPr>
       <w:r>
+        <w:t>2.2. Расчет рыночного потенциала по модели TAM-SAM-SOM</w:t>
+      </w:r>
+    </w:p>
+    <w:p>
+      <w:r>
+        <w:rPr>
+          <w:color w:val="000000"/>
+        </w:rPr>
+        <w:t>Для оценки стратегического потенциала проекта использована модель TAM-SAM-SOM. Она позволяет разделить общий объем рынка, доступный сегмент и реалистично достижимую долю компании. В настоящей работе расчеты представлены в денежном выражении, поскольку ключевой управленческий ориентир ГК «Ресурс» - восстановление выручки и достижение уровня 1 млрд руб.</w:t>
+      </w:r>
+    </w:p>
+    <w:p>
+      <w:r>
+        <w:rPr>
+          <w:color w:val="000000"/>
+        </w:rPr>
+        <w:t>TAM рассматривается как совокупный платежеспособный спрос на первичную недвижимость в регионе и смежных сегментах, к которым компания теоретически может получить доступ при масштабировании портфеля. SAM ограничивается рынком первичного жилья г. Ижевска и целевыми сегментами, соответствующими проектам компании. SOM определяется фактической и целевой долей ГК «Ресурс» в доступном рынке.</w:t>
+      </w:r>
+    </w:p>
+    <w:p>
+      <w:r>
+        <w:rPr>
+          <w:color w:val="000000"/>
+        </w:rPr>
         <w:lastRenderedPageBreak/>
-        <w:t>2.2. Расчет рыночного потенциала по модели TAM-SAM-SOM</w:t>
-      </w:r>
-    </w:p>
-    <w:p>
-      <w:r>
-        <w:rPr>
-          <w:color w:val="000000"/>
-        </w:rPr>
-        <w:t>Для оценки стратегического потенциала проекта использована модель TAM-SAM-SOM. Она позволяет разделить общий объем рынка, доступный сегмент и реалистично достижимую долю компании. В настоящей работе расчеты представлены в денежном выражении, поскольку ключевой управленческий ориентир ГК «Ресурс» - восстановление выручки и достижение уровня 1 млрд руб.</w:t>
-      </w:r>
-    </w:p>
-    <w:p>
-      <w:r>
-        <w:rPr>
-          <w:color w:val="000000"/>
-        </w:rPr>
-        <w:t>TAM рассматривается как совокупный платежеспособный спрос на первичную недвижимость в регионе и смежных сегментах, к которым компания теоретически может получить доступ при масштабировании портфеля. SAM ограничивается рынком первичного жилья г. Ижевска и целевыми сегментами, соответствующими проектам компании. SOM определяется фактической и целевой долей ГК «Ресурс» в доступном рынке.</w:t>
-      </w:r>
-    </w:p>
-    <w:p>
-      <w:r>
-        <w:rPr>
-          <w:color w:val="000000"/>
-        </w:rPr>
         <w:t>При объеме доступного рынка Ижевска 40,63 млрд руб. и фактической выручке ГК «Ресурс» 606,4 млн руб. текущая доля компании составляет: Share = 606,4 / 40 630 × 100% = 1,49%. Для восстановления выручки до 1 млрд руб. целевая доля должна составить: Share target = 1 000 / 40 630 × 100% = 2,46%. Следовательно, компании необходимо не доминировать на рынке, а вернуть управляемость продаж и увеличить долю примерно на 0,97 процентного пункта.</w:t>
       </w:r>
     </w:p>
@@ -2660,7 +2472,6 @@
                 <w:color w:val="000000"/>
                 <w:sz w:val="24"/>
               </w:rPr>
-              <w:lastRenderedPageBreak/>
               <w:t>Необходимый прирост</w:t>
             </w:r>
           </w:p>
@@ -2709,24 +2520,30 @@
         <w:pStyle w:val="21"/>
       </w:pPr>
       <w:r>
+        <w:t>2.3. Когортный анализ продаж объектов ГК «Ресурс»</w:t>
+      </w:r>
+    </w:p>
+    <w:p>
+      <w:r>
+        <w:rPr>
+          <w:color w:val="000000"/>
+        </w:rPr>
+        <w:t>Внутренняя статистика продаж показывает различия между объектами массового сегмента и проектом бизнес-класса. Массовые проекты в 2025 г. столкнулись с остатками менее ликвидного ассортимента и более высокой чувствительностью покупателей к ипотечной ставке. Проект ЖК «Lighthouse», напротив, сохранил потенциал роста благодаря видовому расположению, ограниченному предложению и более платежеспособной аудитории.</w:t>
+      </w:r>
+    </w:p>
+    <w:p>
+      <w:r>
+        <w:rPr>
+          <w:color w:val="000000"/>
+        </w:rPr>
+        <w:t xml:space="preserve">Следовательно, дальнейшая стратегия продаж должна быть дифференцированной. Для массовых объектов требуется ускорение реализации остаточного ассортимента через акции, пакетные предложения и риелторские сценарии. Для ЖК «Lighthouse» требуется не демпинг, а усиление </w:t>
+      </w:r>
+      <w:r>
+        <w:rPr>
+          <w:color w:val="000000"/>
+        </w:rPr>
         <w:lastRenderedPageBreak/>
-        <w:t>2.3. Когортный анализ продаж объектов ГК «Ресурс»</w:t>
-      </w:r>
-    </w:p>
-    <w:p>
-      <w:r>
-        <w:rPr>
-          <w:color w:val="000000"/>
-        </w:rPr>
-        <w:t>Внутренняя статистика продаж показывает различия между объектами массового сегмента и проектом бизнес-класса. Массовые проекты в 2025 г. столкнулись с остатками менее ликвидного ассортимента и более высокой чувствительностью покупателей к ипотечной ставке. Проект ЖК «Lighthouse», напротив, сохранил потенциал роста благодаря видовому расположению, ограниченному предложению и более платежеспособной аудитории.</w:t>
-      </w:r>
-    </w:p>
-    <w:p>
-      <w:r>
-        <w:rPr>
-          <w:color w:val="000000"/>
-        </w:rPr>
-        <w:t>Следовательно, дальнейшая стратегия продаж должна быть дифференцированной. Для массовых объектов требуется ускорение реализации остаточного ассортимента через акции, пакетные предложения и риелторские сценарии. Для ЖК «Lighthouse» требуется не демпинг, а усиление экспертной продажи: качественные материалы, быстрый подбор лота, обоснование ликвидности и прозрачная защита сделки для агента.</w:t>
+        <w:t>экспертной продажи: качественные материалы, быстрый подбор лота, обоснование ликвидности и прозрачная защита сделки для агента.</w:t>
       </w:r>
     </w:p>
     <w:p>
@@ -3074,7 +2891,6 @@
         <w:pStyle w:val="21"/>
       </w:pPr>
       <w:r>
-        <w:lastRenderedPageBreak/>
         <w:t>2.4. SWOT- и PESTEL-анализ</w:t>
       </w:r>
     </w:p>
@@ -3212,6 +3028,7 @@
                 <w:color w:val="000000"/>
                 <w:sz w:val="24"/>
               </w:rPr>
+              <w:lastRenderedPageBreak/>
               <w:t>Использование Bitrix24 и Profitbase как основы для интеграции будущего портала.</w:t>
             </w:r>
           </w:p>
@@ -3527,7 +3344,6 @@
                 <w:color w:val="000000"/>
                 <w:sz w:val="24"/>
               </w:rPr>
-              <w:lastRenderedPageBreak/>
               <w:t>Повышение роли риелтора как консультанта покупателя в сложной ипотечной среде.</w:t>
             </w:r>
           </w:p>
@@ -3735,25 +3551,42 @@
                 <w:color w:val="000000"/>
                 <w:sz w:val="24"/>
               </w:rPr>
-              <w:t>Высокая ставка, рост стоимости фондирования и снижение доступности кредита.</w:t>
-            </w:r>
-          </w:p>
-        </w:tc>
-        <w:tc>
-          <w:tcPr>
-            <w:tcW w:w="3118" w:type="dxa"/>
-          </w:tcPr>
-          <w:p>
-            <w:pPr>
-              <w:ind w:firstLine="0"/>
-              <w:jc w:val="left"/>
-            </w:pPr>
-            <w:r>
-              <w:rPr>
-                <w:color w:val="000000"/>
-                <w:sz w:val="24"/>
-              </w:rPr>
-              <w:t>Фокус на рассрочки, альтернативные схемы и снижение рекламного риска.</w:t>
+              <w:t xml:space="preserve">Высокая ставка, рост стоимости фондирования и </w:t>
+            </w:r>
+            <w:r>
+              <w:rPr>
+                <w:color w:val="000000"/>
+                <w:sz w:val="24"/>
+              </w:rPr>
+              <w:lastRenderedPageBreak/>
+              <w:t>снижение доступности кредита.</w:t>
+            </w:r>
+          </w:p>
+        </w:tc>
+        <w:tc>
+          <w:tcPr>
+            <w:tcW w:w="3118" w:type="dxa"/>
+          </w:tcPr>
+          <w:p>
+            <w:pPr>
+              <w:ind w:firstLine="0"/>
+              <w:jc w:val="left"/>
+            </w:pPr>
+            <w:r>
+              <w:rPr>
+                <w:color w:val="000000"/>
+                <w:sz w:val="24"/>
+              </w:rPr>
+              <w:lastRenderedPageBreak/>
+              <w:t xml:space="preserve">Фокус на рассрочки, альтернативные схемы и </w:t>
+            </w:r>
+            <w:r>
+              <w:rPr>
+                <w:color w:val="000000"/>
+                <w:sz w:val="24"/>
+              </w:rPr>
+              <w:lastRenderedPageBreak/>
+              <w:t>снижение рекламного риска.</w:t>
             </w:r>
           </w:p>
         </w:tc>
@@ -3776,6 +3609,7 @@
                 <w:color w:val="000000"/>
                 <w:sz w:val="24"/>
               </w:rPr>
+              <w:lastRenderedPageBreak/>
               <w:t>Social</w:t>
             </w:r>
           </w:p>
@@ -3942,31 +3776,31 @@
         <w:pStyle w:val="21"/>
       </w:pPr>
       <w:r>
+        <w:t>2.5. Обоснование стратегии цифровизации агентского канала</w:t>
+      </w:r>
+    </w:p>
+    <w:p>
+      <w:r>
+        <w:rPr>
+          <w:color w:val="000000"/>
+        </w:rPr>
+        <w:t>Проведенный анализ показывает, что наиболее рациональной стратегией для ГК «Ресурс» является не увеличение рекламного давления, а повышение управляемости агентского канала. Компания не конкурирует с крупнейшими девелоперами по широте ассортимента и бюджету продвижения, но может конкурировать по скорости, прозрачности и качеству партнерского сервиса.</w:t>
+      </w:r>
+    </w:p>
+    <w:p>
+      <w:r>
+        <w:rPr>
+          <w:color w:val="000000"/>
+        </w:rPr>
+        <w:t>Содержательно стратегия цифровизации строится на трех принципах. Первый принцип - единое окно для партнера: агент должен самостоятельно регистрировать клиента, видеть актуальные лоты и получать статус сделки. Второй принцип - интеграция без замены базовых систем: Bitrix24 и Profitbase остаются ядром данных, а портал выступает внешней PRM-надстройкой. Третий принцип - управление по KPI: РОП получает не только список сделок, но и рейтинг агентств, конверсию, скорость реакции и структуру бронирований.</w:t>
+      </w:r>
+    </w:p>
+    <w:p>
+      <w:r>
+        <w:rPr>
+          <w:color w:val="000000"/>
+        </w:rPr>
         <w:lastRenderedPageBreak/>
-        <w:t>2.5. Обоснование стратегии цифровизации агентского канала</w:t>
-      </w:r>
-    </w:p>
-    <w:p>
-      <w:r>
-        <w:rPr>
-          <w:color w:val="000000"/>
-        </w:rPr>
-        <w:t>Проведенный анализ показывает, что наиболее рациональной стратегией для ГК «Ресурс» является не увеличение рекламного давления, а повышение управляемости агентского канала. Компания не конкурирует с крупнейшими девелоперами по широте ассортимента и бюджету продвижения, но может конкурировать по скорости, прозрачности и качеству партнерского сервиса.</w:t>
-      </w:r>
-    </w:p>
-    <w:p>
-      <w:r>
-        <w:rPr>
-          <w:color w:val="000000"/>
-        </w:rPr>
-        <w:t>Содержательно стратегия цифровизации строится на трех принципах. Первый принцип - единое окно для партнера: агент должен самостоятельно регистрировать клиента, видеть актуальные лоты и получать статус сделки. Второй принцип - интеграция без замены базовых систем: Bitrix24 и Profitbase остаются ядром данных, а портал выступает внешней PRM-надстройкой. Третий принцип - управление по KPI: РОП получает не только список сделок, но и рейтинг агентств, конверсию, скорость реакции и структуру бронирований.</w:t>
-      </w:r>
-    </w:p>
-    <w:p>
-      <w:r>
-        <w:rPr>
-          <w:color w:val="000000"/>
-        </w:rPr>
         <w:t>Таким образом, глава 2 подтверждает необходимость разработки Resource Partner AI как практического проекта. Решение должно быть достаточно легким для MVP, но при этом логически соответствовать требованиям корпоративного B2B SaaS: ролевая модель, единая база данных, интеграционные интерфейсы, аналитика и возможность дальнейшего подключения ИИ-функций.</w:t>
       </w:r>
     </w:p>
@@ -3984,54 +3818,53 @@
         <w:pStyle w:val="21"/>
       </w:pPr>
       <w:r>
+        <w:t>3.1. Обзор инструментов рынка и выбор решения</w:t>
+      </w:r>
+    </w:p>
+    <w:p>
+      <w:r>
+        <w:rPr>
+          <w:color w:val="000000"/>
+        </w:rPr>
+        <w:t>Перед проектированием собственного решения необходимо сопоставить доступные инструменты, которые применяются девелоперами и отделами продаж недвижимости. На рынке представлены универсальные CRM-системы, отраслевые платформы для застройщиков, классифайды и маркетплейсы недвижимости, а также собственные B2B-порталы компаний. Выбор не должен сводиться к покупке наиболее функционального продукта: для ГК «Ресурс» критичны бюджетные ограничения, наличие уже внедренных Bitrix24 и Profitbase, потребность в быстром MVP и возможность показать результат на защите.</w:t>
+      </w:r>
+    </w:p>
+    <w:p>
+      <w:r>
+        <w:rPr>
+          <w:color w:val="000000"/>
+        </w:rPr>
+        <w:t>Bitrix24 целесообразно рассматривать как базовую CRM и операционный центр отдела продаж. Платформа предоставляет CRM, задачи, воронки, Gantt, коммуникации, автоматизацию и API. Официальная документация Bitrix24 REST API 3.0 описывает единый формат ответа, работу через POST-запросы и возможность получения OpenAPI-документации [6]. Это делает Bitrix24 удобным ядром для хранения лидов, сделок и задач.</w:t>
+      </w:r>
+    </w:p>
+    <w:p>
+      <w:r>
+        <w:rPr>
+          <w:color w:val="000000"/>
+        </w:rPr>
+        <w:t>amoCRM является альтернативной CRM, ориентированной на малый и средний бизнес. Ее преимущество - простота воронки и быстрый запуск, однако для ГК «Ресурс» переход с Bitrix24 на amoCRM создаст избыточные миграционные расходы. Официальная страница тарифов amoCRM указывает базовые тарифы 599, 1199 и 1699 руб. за пользователя в месяц при указанных условиях оплаты [8].</w:t>
+      </w:r>
+    </w:p>
+    <w:p>
+      <w:r>
+        <w:rPr>
+          <w:color w:val="000000"/>
+        </w:rPr>
+        <w:t xml:space="preserve">Profitbase закрывает отраслевую специфику девелопера. В материалах Profitbase описаны интерактивная витрина объектов, актуализация ассортимента, бронирование, динамическое ценообразование, аналитика и интеграции с CRM [9; 10]. Для ГК «Ресурс» это важный актив, поскольку </w:t>
+      </w:r>
+      <w:r>
+        <w:rPr>
+          <w:color w:val="000000"/>
+        </w:rPr>
         <w:lastRenderedPageBreak/>
-        <w:t>3.1. Обзор инструментов рынка и выбор решения</w:t>
-      </w:r>
-    </w:p>
-    <w:p>
-      <w:r>
-        <w:rPr>
-          <w:color w:val="000000"/>
-        </w:rPr>
-        <w:t xml:space="preserve">Перед проектированием собственного решения необходимо сопоставить доступные инструменты, которые применяются девелоперами и отделами продаж недвижимости. На рынке представлены универсальные CRM-системы, отраслевые платформы для застройщиков, классифайды и маркетплейсы недвижимости, а также собственные B2B-порталы компаний. Выбор не должен сводиться к покупке наиболее функционального продукта: для ГК «Ресурс» критичны бюджетные ограничения, наличие уже внедренных Bitrix24 и Profitbase, потребность в быстром </w:t>
-      </w:r>
-      <w:r>
-        <w:rPr>
-          <w:color w:val="000000"/>
-        </w:rPr>
-        <w:t>MVP и возможность показать результат на защите.</w:t>
-      </w:r>
-    </w:p>
-    <w:p>
-      <w:r>
-        <w:rPr>
-          <w:color w:val="000000"/>
-        </w:rPr>
-        <w:t>Bitrix24 целесообразно рассматривать как базовую CRM и операционный центр отдела продаж. Платформа предоставляет CRM, задачи, воронки, Gantt, коммуникации, автоматизацию и API. Официальная документация Bitrix24 REST API 3.0 описывает единый формат ответа, работу через POST-запросы и возможность получения OpenAPI-документации [6]. Это делает Bitrix24 удобным ядром для хранения лидов, сделок и задач.</w:t>
-      </w:r>
-    </w:p>
-    <w:p>
-      <w:r>
-        <w:rPr>
-          <w:color w:val="000000"/>
-        </w:rPr>
-        <w:t>amoCRM является альтернативной CRM, ориентированной на малый и средний бизнес. Ее преимущество - простота воронки и быстрый запуск, однако для ГК «Ресурс» переход с Bitrix24 на amoCRM создаст избыточные миграционные расходы. Официальная страница тарифов amoCRM указывает базовые тарифы 599, 1199 и 1699 руб. за пользователя в месяц при указанных условиях оплаты [8].</w:t>
-      </w:r>
-    </w:p>
-    <w:p>
-      <w:r>
-        <w:rPr>
-          <w:color w:val="000000"/>
-        </w:rPr>
-        <w:t>Profitbase закрывает отраслевую специфику девелопера. В материалах Profitbase описаны интерактивная витрина объектов, актуализация ассортимента, бронирование, динамическое ценообразование, аналитика и интеграции с CRM [9; 10]. Для ГК «Ресурс» это важный актив, поскольку портал может получать статусы лотов и коммерческие параметры не из ручных таблиц, а из специализированного источника.</w:t>
-      </w:r>
-    </w:p>
-    <w:p>
-      <w:r>
-        <w:rPr>
-          <w:color w:val="000000"/>
-        </w:rPr>
-        <w:lastRenderedPageBreak/>
+        <w:t>портал может получать статусы лотов и коммерческие параметры не из ручных таблиц, а из специализированного источника.</w:t>
+      </w:r>
+    </w:p>
+    <w:p>
+      <w:r>
+        <w:rPr>
+          <w:color w:val="000000"/>
+        </w:rPr>
         <w:t>Классифайды и маркетплейсы недвижимости, включая крупные площадки объявлений и банковские экосистемы, решают задачу охвата, но не заменяют управление партнерской сетью. Они приводят внешний спрос, однако не дают застройщику полной логики защиты сделки, мотивации конкретного агентства, обучения партнеров и внутренней KPI-аналитики.</w:t>
       </w:r>
     </w:p>
@@ -4355,7 +4188,15 @@
                 <w:color w:val="000000"/>
                 <w:sz w:val="24"/>
               </w:rPr>
-              <w:t>Не выбирать как основное направление, использовать только как бенчмарк простоты.</w:t>
+              <w:t xml:space="preserve">Не выбирать как основное направление, использовать только как </w:t>
+            </w:r>
+            <w:r>
+              <w:rPr>
+                <w:color w:val="000000"/>
+                <w:sz w:val="24"/>
+              </w:rPr>
+              <w:lastRenderedPageBreak/>
+              <w:t>бенчмарк простоты.</w:t>
             </w:r>
           </w:p>
         </w:tc>
@@ -4651,31 +4492,49 @@
     <w:p>
       <w:pPr>
         <w:pStyle w:val="21"/>
-      </w:pPr>
-      <w:r>
+        <w:rPr>
+          <w:lang w:val="en-US"/>
+        </w:rPr>
+      </w:pPr>
+      <w:r>
+        <w:rPr>
+          <w:lang w:val="en-US"/>
+        </w:rPr>
+        <w:t xml:space="preserve">3.2. </w:t>
+      </w:r>
+      <w:r>
+        <w:t>Концепция</w:t>
+      </w:r>
+      <w:r>
+        <w:rPr>
+          <w:lang w:val="en-US"/>
+        </w:rPr>
+        <w:t xml:space="preserve"> B2B AI SaaS-</w:t>
+      </w:r>
+      <w:r>
+        <w:t>портала</w:t>
+      </w:r>
+      <w:r>
+        <w:rPr>
+          <w:lang w:val="en-US"/>
+        </w:rPr>
+        <w:t xml:space="preserve"> Resource Partner AI</w:t>
+      </w:r>
+    </w:p>
+    <w:p>
+      <w:r>
+        <w:rPr>
+          <w:color w:val="000000"/>
+        </w:rPr>
+        <w:t>Resource Partner AI предлагается рассматривать как B2B AI SaaS-решение для управления партнерскими продажами девелопера. B2B означает, что основным пользователем является не конечный покупатель квартиры, а агентство недвижимости и его специалисты. SaaS означает, что функциональность предоставляется через веб-интерфейс без установки локального ПО у партнера. AI-компонент означает возможность подключения интеллектуальных подсказок, скоринга и рекомендаций на основе данных о клиентах, объектах и эффективности агентств.</w:t>
+      </w:r>
+    </w:p>
+    <w:p>
+      <w:r>
+        <w:rPr>
+          <w:color w:val="000000"/>
+        </w:rPr>
         <w:lastRenderedPageBreak/>
-        <w:t>3.2. Концепция B2B AI SaaS-портала Resource Partner AI</w:t>
-      </w:r>
-    </w:p>
-    <w:p>
-      <w:r>
-        <w:rPr>
-          <w:color w:val="000000"/>
-        </w:rPr>
-        <w:t xml:space="preserve">Resource Partner AI предлагается рассматривать как B2B AI SaaS-решение для управления партнерскими продажами девелопера. B2B означает, что основным пользователем является не конечный покупатель квартиры, а агентство недвижимости и его специалисты. SaaS означает, что функциональность предоставляется через веб-интерфейс без установки локального ПО у партнера. AI-компонент означает возможность подключения интеллектуальных подсказок, скоринга и рекомендаций на основе данных о клиентах, объектах и эффективности </w:t>
-      </w:r>
-      <w:r>
-        <w:rPr>
-          <w:color w:val="000000"/>
-        </w:rPr>
-        <w:t>агентств.</w:t>
-      </w:r>
-    </w:p>
-    <w:p>
-      <w:r>
-        <w:rPr>
-          <w:color w:val="000000"/>
-        </w:rPr>
         <w:t>Цель портала - превратить агентский канал из неформальной сети коммуникаций в управляемую цифровую экосистему. Для агента портал должен быть рабочим кабинетом: регистрация клиента, проверка уникальности, подбор объектов, просмотр презентационных материалов, фиксация брони и отслеживание статуса комиссии. Для менеджера ГК «Ресурс» портал должен быть инструментом контроля и обработки качественных обращений. Для РОПа - системой визуализации KPI и раннего выявления проблем в партнерской сети.</w:t>
       </w:r>
     </w:p>
@@ -4705,7 +4564,6 @@
           <w:b/>
           <w:color w:val="000000"/>
         </w:rPr>
-        <w:lastRenderedPageBreak/>
         <w:t>Таблица 3.2 - Ролевая модель Resource Partner AI</w:t>
       </w:r>
     </w:p>
@@ -4919,6 +4777,7 @@
                 <w:color w:val="000000"/>
                 <w:sz w:val="24"/>
               </w:rPr>
+              <w:lastRenderedPageBreak/>
               <w:t>РОП</w:t>
             </w:r>
           </w:p>
@@ -5026,40 +4885,46 @@
         <w:pStyle w:val="21"/>
       </w:pPr>
       <w:r>
+        <w:t>3.3. Функциональная и техническая архитектура MVP</w:t>
+      </w:r>
+    </w:p>
+    <w:p>
+      <w:r>
+        <w:rPr>
+          <w:color w:val="000000"/>
+        </w:rPr>
+        <w:t>MVP Resource Partner AI реализуется как веб-приложение на Python/Django с использованием серверного рендеринга HTML-страниц. Такой подход соответствует ограничениям проекта: он позволяет быстро собрать рабочий прототип, не усложняя архитектуру отдельным фронтенд-приложением и микросервисами. При дальнейшем развитии MVP может быть преобразован в полноценный SaaS-продукт с отдельным API и масштабируемой базой данных.</w:t>
+      </w:r>
+    </w:p>
+    <w:p>
+      <w:r>
+        <w:rPr>
+          <w:color w:val="000000"/>
+        </w:rPr>
+        <w:t>В ядре данных предусматриваются сущности: пользователь, агентство, агент, объект недвижимости, лот, клиент, регистрация сделки, бронь, активность партнера и KPI-показатель. Связь между лотом и сделкой позволяет отслеживать, какие квартиры чаще просматриваются, какие уходят в бронь, где возникают задержки и какие агентства дают наиболее качественный поток клиентов.</w:t>
+      </w:r>
+    </w:p>
+    <w:p>
+      <w:r>
+        <w:rPr>
+          <w:color w:val="000000"/>
+        </w:rPr>
+        <w:t>Интеграционный слой должен поддерживать обмен данными с Bitrix24 и Profitbase. Bitrix24 целесообразно использовать для передачи лидов и сделок в основную CRM, а Profitbase - для получения актуальных статусов лотов, цен и параметров объектов. На MVP-этапе допускается использовать демонстрационные данные, однако архитектура должна быть подготовлена к подключению REST API и вебхуков [6; 10].</w:t>
+      </w:r>
+    </w:p>
+    <w:p>
+      <w:r>
+        <w:rPr>
+          <w:color w:val="000000"/>
+        </w:rPr>
+        <w:t xml:space="preserve">AI-слой на первом этапе может работать как вспомогательная функция: формирование текстового описания объекта для агента, подсказки по </w:t>
+      </w:r>
+      <w:r>
+        <w:rPr>
+          <w:color w:val="000000"/>
+        </w:rPr>
         <w:lastRenderedPageBreak/>
-        <w:t>3.3. Функциональная и техническая архитектура MVP</w:t>
-      </w:r>
-    </w:p>
-    <w:p>
-      <w:r>
-        <w:rPr>
-          <w:color w:val="000000"/>
-        </w:rPr>
-        <w:t>MVP Resource Partner AI реализуется как веб-приложение на Python/Django с использованием серверного рендеринга HTML-страниц. Такой подход соответствует ограничениям проекта: он позволяет быстро собрать рабочий прототип, не усложняя архитектуру отдельным фронтенд-приложением и микросервисами. При дальнейшем развитии MVP может быть преобразован в полноценный SaaS-продукт с отдельным API и масштабируемой базой данных.</w:t>
-      </w:r>
-    </w:p>
-    <w:p>
-      <w:r>
-        <w:rPr>
-          <w:color w:val="000000"/>
-        </w:rPr>
-        <w:t>В ядре данных предусматриваются сущности: пользователь, агентство, агент, объект недвижимости, лот, клиент, регистрация сделки, бронь, активность партнера и KPI-показатель. Связь между лотом и сделкой позволяет отслеживать, какие квартиры чаще просматриваются, какие уходят в бронь, где возникают задержки и какие агентства дают наиболее качественный поток клиентов.</w:t>
-      </w:r>
-    </w:p>
-    <w:p>
-      <w:r>
-        <w:rPr>
-          <w:color w:val="000000"/>
-        </w:rPr>
-        <w:t>Интеграционный слой должен поддерживать обмен данными с Bitrix24 и Profitbase. Bitrix24 целесообразно использовать для передачи лидов и сделок в основную CRM, а Profitbase - для получения актуальных статусов лотов, цен и параметров объектов. На MVP-этапе допускается использовать демонстрационные данные, однако архитектура должна быть подготовлена к подключению REST API и вебхуков [6; 10].</w:t>
-      </w:r>
-    </w:p>
-    <w:p>
-      <w:r>
-        <w:rPr>
-          <w:color w:val="000000"/>
-        </w:rPr>
-        <w:t>AI-слой на первом этапе может работать как вспомогательная функция: формирование текстового описания объекта для агента, подсказки по аргументации, оценка приоритета обращения и рекомендация следующего действия. На промышленном этапе AI-модуль целесообразно подключать только после накопления достаточного набора качественных данных и проверки юридических ограничений на обработку персональных данных.</w:t>
+        <w:t>аргументации, оценка приоритета обращения и рекомендация следующего действия. На промышленном этапе AI-модуль целесообразно подключать только после накопления достаточного набора качественных данных и проверки юридических ограничений на обработку персональных данных.</w:t>
       </w:r>
     </w:p>
     <w:p>
@@ -5167,7 +5032,6 @@
                 <w:color w:val="000000"/>
                 <w:sz w:val="24"/>
               </w:rPr>
-              <w:lastRenderedPageBreak/>
               <w:t>Авторизация и роли</w:t>
             </w:r>
           </w:p>
@@ -5511,23 +5375,23 @@
         <w:pStyle w:val="21"/>
       </w:pPr>
       <w:r>
+        <w:t>3.4. Реинжиниринг бизнес-процессов агентских продаж</w:t>
+      </w:r>
+    </w:p>
+    <w:p>
+      <w:r>
+        <w:rPr>
+          <w:color w:val="000000"/>
+        </w:rPr>
+        <w:t>Внедрение портала требует изменения логики работы коммерческого блока. В текущей модели агент отправляет запрос менеджеру, менеджер вручную проверяет клиента, уточняет наличие лота, согласует бронь и сообщает результат. В целевой модели агент выполняет первичное действие самостоятельно, а менеджер подключается на этапах, где действительно требуется экспертное решение или подтверждение нестандартных условий.</w:t>
+      </w:r>
+    </w:p>
+    <w:p>
+      <w:r>
+        <w:rPr>
+          <w:color w:val="000000"/>
+        </w:rPr>
         <w:lastRenderedPageBreak/>
-        <w:t>3.4. Реинжиниринг бизнес-процессов агентских продаж</w:t>
-      </w:r>
-    </w:p>
-    <w:p>
-      <w:r>
-        <w:rPr>
-          <w:color w:val="000000"/>
-        </w:rPr>
-        <w:t>Внедрение портала требует изменения логики работы коммерческого блока. В текущей модели агент отправляет запрос менеджеру, менеджер вручную проверяет клиента, уточняет наличие лота, согласует бронь и сообщает результат. В целевой модели агент выполняет первичное действие самостоятельно, а менеджер подключается на этапах, где действительно требуется экспертное решение или подтверждение нестандартных условий.</w:t>
-      </w:r>
-    </w:p>
-    <w:p>
-      <w:r>
-        <w:rPr>
-          <w:color w:val="000000"/>
-        </w:rPr>
         <w:t>Целевой процесс начинается с авторизации агента и регистрации клиента. Система фиксирует время регистрации, агентство, контактные данные и интересующий объект. Далее выполняется проверка уникальности клиента: если клиент уже закреплен за другим источником, система показывает конфликтный статус; если клиент свободен, агент получает защиту сделки на регламентированный срок.</w:t>
       </w:r>
     </w:p>
@@ -5821,7 +5685,6 @@
                 <w:color w:val="000000"/>
                 <w:sz w:val="24"/>
               </w:rPr>
-              <w:lastRenderedPageBreak/>
               <w:t>Бронь</w:t>
             </w:r>
           </w:p>
@@ -5967,16 +5830,17 @@
         <w:tblStyle w:val="ad"/>
         <w:tblW w:w="0" w:type="auto"/>
         <w:jc w:val="center"/>
+        <w:tblLayout w:type="fixed"/>
         <w:tblLook w:val="04A0" w:firstRow="1" w:lastRow="0" w:firstColumn="1" w:lastColumn="0" w:noHBand="0" w:noVBand="1"/>
       </w:tblPr>
       <w:tblGrid>
-        <w:gridCol w:w="1401"/>
-        <w:gridCol w:w="1644"/>
-        <w:gridCol w:w="1207"/>
-        <w:gridCol w:w="1207"/>
-        <w:gridCol w:w="1207"/>
-        <w:gridCol w:w="1207"/>
-        <w:gridCol w:w="1472"/>
+        <w:gridCol w:w="1304"/>
+        <w:gridCol w:w="2438"/>
+        <w:gridCol w:w="453"/>
+        <w:gridCol w:w="453"/>
+        <w:gridCol w:w="453"/>
+        <w:gridCol w:w="453"/>
+        <w:gridCol w:w="2381"/>
       </w:tblGrid>
       <w:tr>
         <w:trPr>
@@ -5984,18 +5848,19 @@
         </w:trPr>
         <w:tc>
           <w:tcPr>
-            <w:tcW w:w="1336" w:type="dxa"/>
+            <w:tcW w:w="1304" w:type="dxa"/>
             <w:vAlign w:val="center"/>
           </w:tcPr>
           <w:p>
             <w:pPr>
+              <w:spacing w:line="240" w:lineRule="auto"/>
+              <w:ind w:firstLine="0"/>
               <w:jc w:val="center"/>
             </w:pPr>
             <w:r>
               <w:rPr>
                 <w:b/>
-                <w:color w:val="000000"/>
-                <w:sz w:val="24"/>
+                <w:sz w:val="18"/>
               </w:rPr>
               <w:t>Этап</w:t>
             </w:r>
@@ -6003,115 +5868,125 @@
         </w:tc>
         <w:tc>
           <w:tcPr>
-            <w:tcW w:w="1336" w:type="dxa"/>
+            <w:tcW w:w="2438" w:type="dxa"/>
             <w:vAlign w:val="center"/>
           </w:tcPr>
           <w:p>
             <w:pPr>
+              <w:spacing w:line="240" w:lineRule="auto"/>
+              <w:ind w:firstLine="0"/>
               <w:jc w:val="center"/>
             </w:pPr>
             <w:r>
               <w:rPr>
                 <w:b/>
-                <w:color w:val="000000"/>
-                <w:sz w:val="24"/>
-              </w:rPr>
-              <w:t>Содержание работ</w:t>
-            </w:r>
-          </w:p>
-        </w:tc>
-        <w:tc>
-          <w:tcPr>
-            <w:tcW w:w="1336" w:type="dxa"/>
+                <w:sz w:val="18"/>
+              </w:rPr>
+              <w:t>Работы</w:t>
+            </w:r>
+          </w:p>
+        </w:tc>
+        <w:tc>
+          <w:tcPr>
+            <w:tcW w:w="453" w:type="dxa"/>
+            <w:noWrap/>
             <w:vAlign w:val="center"/>
           </w:tcPr>
           <w:p>
             <w:pPr>
+              <w:spacing w:line="240" w:lineRule="auto"/>
+              <w:ind w:firstLine="0"/>
               <w:jc w:val="center"/>
             </w:pPr>
             <w:r>
               <w:rPr>
                 <w:b/>
-                <w:color w:val="000000"/>
-                <w:sz w:val="24"/>
-              </w:rPr>
-              <w:t>Месяц 1</w:t>
-            </w:r>
-          </w:p>
-        </w:tc>
-        <w:tc>
-          <w:tcPr>
-            <w:tcW w:w="1336" w:type="dxa"/>
+                <w:sz w:val="18"/>
+              </w:rPr>
+              <w:t>1</w:t>
+            </w:r>
+          </w:p>
+        </w:tc>
+        <w:tc>
+          <w:tcPr>
+            <w:tcW w:w="453" w:type="dxa"/>
+            <w:noWrap/>
             <w:vAlign w:val="center"/>
           </w:tcPr>
           <w:p>
             <w:pPr>
+              <w:spacing w:line="240" w:lineRule="auto"/>
+              <w:ind w:firstLine="0"/>
               <w:jc w:val="center"/>
             </w:pPr>
             <w:r>
               <w:rPr>
                 <w:b/>
-                <w:color w:val="000000"/>
-                <w:sz w:val="24"/>
-              </w:rPr>
-              <w:t>Месяц 2</w:t>
-            </w:r>
-          </w:p>
-        </w:tc>
-        <w:tc>
-          <w:tcPr>
-            <w:tcW w:w="1336" w:type="dxa"/>
+                <w:sz w:val="18"/>
+              </w:rPr>
+              <w:t>2</w:t>
+            </w:r>
+          </w:p>
+        </w:tc>
+        <w:tc>
+          <w:tcPr>
+            <w:tcW w:w="453" w:type="dxa"/>
+            <w:noWrap/>
             <w:vAlign w:val="center"/>
           </w:tcPr>
           <w:p>
             <w:pPr>
+              <w:spacing w:line="240" w:lineRule="auto"/>
+              <w:ind w:firstLine="0"/>
               <w:jc w:val="center"/>
             </w:pPr>
             <w:r>
               <w:rPr>
                 <w:b/>
-                <w:color w:val="000000"/>
-                <w:sz w:val="24"/>
-              </w:rPr>
-              <w:t>Месяц 3</w:t>
-            </w:r>
-          </w:p>
-        </w:tc>
-        <w:tc>
-          <w:tcPr>
-            <w:tcW w:w="1336" w:type="dxa"/>
+                <w:sz w:val="18"/>
+              </w:rPr>
+              <w:t>3</w:t>
+            </w:r>
+          </w:p>
+        </w:tc>
+        <w:tc>
+          <w:tcPr>
+            <w:tcW w:w="453" w:type="dxa"/>
+            <w:noWrap/>
             <w:vAlign w:val="center"/>
           </w:tcPr>
           <w:p>
             <w:pPr>
+              <w:spacing w:line="240" w:lineRule="auto"/>
+              <w:ind w:firstLine="0"/>
               <w:jc w:val="center"/>
             </w:pPr>
             <w:r>
               <w:rPr>
                 <w:b/>
-                <w:color w:val="000000"/>
-                <w:sz w:val="24"/>
-              </w:rPr>
-              <w:t>Месяц 4</w:t>
-            </w:r>
-          </w:p>
-        </w:tc>
-        <w:tc>
-          <w:tcPr>
-            <w:tcW w:w="1336" w:type="dxa"/>
+                <w:sz w:val="18"/>
+              </w:rPr>
+              <w:t>4</w:t>
+            </w:r>
+          </w:p>
+        </w:tc>
+        <w:tc>
+          <w:tcPr>
+            <w:tcW w:w="2381" w:type="dxa"/>
             <w:vAlign w:val="center"/>
           </w:tcPr>
           <w:p>
             <w:pPr>
+              <w:spacing w:line="240" w:lineRule="auto"/>
+              <w:ind w:firstLine="0"/>
               <w:jc w:val="center"/>
             </w:pPr>
             <w:r>
               <w:rPr>
                 <w:b/>
-                <w:color w:val="000000"/>
-                <w:sz w:val="24"/>
-              </w:rPr>
-              <w:t>Результат</w:t>
+                <w:sz w:val="18"/>
+              </w:rPr>
+              <w:t>Итог</w:t>
             </w:r>
           </w:p>
         </w:tc>
@@ -6122,17 +5997,17 @@
         </w:trPr>
         <w:tc>
           <w:tcPr>
-            <w:tcW w:w="1336" w:type="dxa"/>
-          </w:tcPr>
-          <w:p>
-            <w:pPr>
-              <w:ind w:firstLine="0"/>
-              <w:jc w:val="left"/>
-            </w:pPr>
-            <w:r>
-              <w:rPr>
-                <w:color w:val="000000"/>
-                <w:sz w:val="24"/>
+            <w:tcW w:w="1304" w:type="dxa"/>
+          </w:tcPr>
+          <w:p>
+            <w:pPr>
+              <w:spacing w:line="240" w:lineRule="auto"/>
+              <w:ind w:firstLine="0"/>
+              <w:jc w:val="left"/>
+            </w:pPr>
+            <w:r>
+              <w:rPr>
+                <w:sz w:val="18"/>
               </w:rPr>
               <w:t>1. Проектирование</w:t>
             </w:r>
@@ -6140,17 +6015,17 @@
         </w:tc>
         <w:tc>
           <w:tcPr>
-            <w:tcW w:w="1336" w:type="dxa"/>
-          </w:tcPr>
-          <w:p>
-            <w:pPr>
-              <w:ind w:firstLine="0"/>
-              <w:jc w:val="left"/>
-            </w:pPr>
-            <w:r>
-              <w:rPr>
-                <w:color w:val="000000"/>
-                <w:sz w:val="24"/>
+            <w:tcW w:w="2438" w:type="dxa"/>
+          </w:tcPr>
+          <w:p>
+            <w:pPr>
+              <w:spacing w:line="240" w:lineRule="auto"/>
+              <w:ind w:firstLine="0"/>
+              <w:jc w:val="left"/>
+            </w:pPr>
+            <w:r>
+              <w:rPr>
+                <w:sz w:val="18"/>
               </w:rPr>
               <w:t>ТЗ, роли, сценарии, структура данных, требования к KPI.</w:t>
             </w:r>
@@ -6158,17 +6033,18 @@
         </w:tc>
         <w:tc>
           <w:tcPr>
-            <w:tcW w:w="1336" w:type="dxa"/>
-          </w:tcPr>
-          <w:p>
-            <w:pPr>
-              <w:ind w:firstLine="0"/>
-              <w:jc w:val="left"/>
-            </w:pPr>
-            <w:r>
-              <w:rPr>
-                <w:color w:val="000000"/>
-                <w:sz w:val="24"/>
+            <w:tcW w:w="453" w:type="dxa"/>
+            <w:noWrap/>
+          </w:tcPr>
+          <w:p>
+            <w:pPr>
+              <w:spacing w:line="240" w:lineRule="auto"/>
+              <w:ind w:firstLine="0"/>
+              <w:jc w:val="center"/>
+            </w:pPr>
+            <w:r>
+              <w:rPr>
+                <w:sz w:val="18"/>
               </w:rPr>
               <w:t>X</w:t>
             </w:r>
@@ -6176,50 +6052,56 @@
         </w:tc>
         <w:tc>
           <w:tcPr>
-            <w:tcW w:w="1336" w:type="dxa"/>
-          </w:tcPr>
-          <w:p>
-            <w:pPr>
-              <w:ind w:firstLine="0"/>
-              <w:jc w:val="left"/>
-            </w:pPr>
-          </w:p>
-        </w:tc>
-        <w:tc>
-          <w:tcPr>
-            <w:tcW w:w="1336" w:type="dxa"/>
-          </w:tcPr>
-          <w:p>
-            <w:pPr>
-              <w:ind w:firstLine="0"/>
-              <w:jc w:val="left"/>
-            </w:pPr>
-          </w:p>
-        </w:tc>
-        <w:tc>
-          <w:tcPr>
-            <w:tcW w:w="1336" w:type="dxa"/>
-          </w:tcPr>
-          <w:p>
-            <w:pPr>
-              <w:ind w:firstLine="0"/>
-              <w:jc w:val="left"/>
-            </w:pPr>
-          </w:p>
-        </w:tc>
-        <w:tc>
-          <w:tcPr>
-            <w:tcW w:w="1336" w:type="dxa"/>
-          </w:tcPr>
-          <w:p>
-            <w:pPr>
-              <w:ind w:firstLine="0"/>
-              <w:jc w:val="left"/>
-            </w:pPr>
-            <w:r>
-              <w:rPr>
-                <w:color w:val="000000"/>
-                <w:sz w:val="24"/>
+            <w:tcW w:w="453" w:type="dxa"/>
+            <w:noWrap/>
+          </w:tcPr>
+          <w:p>
+            <w:pPr>
+              <w:spacing w:line="240" w:lineRule="auto"/>
+              <w:ind w:firstLine="0"/>
+              <w:jc w:val="center"/>
+            </w:pPr>
+          </w:p>
+        </w:tc>
+        <w:tc>
+          <w:tcPr>
+            <w:tcW w:w="453" w:type="dxa"/>
+            <w:noWrap/>
+          </w:tcPr>
+          <w:p>
+            <w:pPr>
+              <w:spacing w:line="240" w:lineRule="auto"/>
+              <w:ind w:firstLine="0"/>
+              <w:jc w:val="center"/>
+            </w:pPr>
+          </w:p>
+        </w:tc>
+        <w:tc>
+          <w:tcPr>
+            <w:tcW w:w="453" w:type="dxa"/>
+            <w:noWrap/>
+          </w:tcPr>
+          <w:p>
+            <w:pPr>
+              <w:spacing w:line="240" w:lineRule="auto"/>
+              <w:ind w:firstLine="0"/>
+              <w:jc w:val="center"/>
+            </w:pPr>
+          </w:p>
+        </w:tc>
+        <w:tc>
+          <w:tcPr>
+            <w:tcW w:w="2381" w:type="dxa"/>
+          </w:tcPr>
+          <w:p>
+            <w:pPr>
+              <w:spacing w:line="240" w:lineRule="auto"/>
+              <w:ind w:firstLine="0"/>
+              <w:jc w:val="left"/>
+            </w:pPr>
+            <w:r>
+              <w:rPr>
+                <w:sz w:val="18"/>
               </w:rPr>
               <w:t>Согласованное ТЗ и прототип процессов.</w:t>
             </w:r>
@@ -6232,17 +6114,17 @@
         </w:trPr>
         <w:tc>
           <w:tcPr>
-            <w:tcW w:w="1336" w:type="dxa"/>
-          </w:tcPr>
-          <w:p>
-            <w:pPr>
-              <w:ind w:firstLine="0"/>
-              <w:jc w:val="left"/>
-            </w:pPr>
-            <w:r>
-              <w:rPr>
-                <w:color w:val="000000"/>
-                <w:sz w:val="24"/>
+            <w:tcW w:w="1304" w:type="dxa"/>
+          </w:tcPr>
+          <w:p>
+            <w:pPr>
+              <w:spacing w:line="240" w:lineRule="auto"/>
+              <w:ind w:firstLine="0"/>
+              <w:jc w:val="left"/>
+            </w:pPr>
+            <w:r>
+              <w:rPr>
+                <w:sz w:val="18"/>
               </w:rPr>
               <w:t>2. MVP</w:t>
             </w:r>
@@ -6250,35 +6132,36 @@
         </w:tc>
         <w:tc>
           <w:tcPr>
-            <w:tcW w:w="1336" w:type="dxa"/>
-          </w:tcPr>
-          <w:p>
-            <w:pPr>
-              <w:ind w:firstLine="0"/>
-              <w:jc w:val="left"/>
-            </w:pPr>
-            <w:r>
-              <w:rPr>
-                <w:color w:val="000000"/>
-                <w:sz w:val="24"/>
-              </w:rPr>
-              <w:t>Разработка кабинетов агента, менеджера, РОПа, каталога и защиты сделки.</w:t>
-            </w:r>
-          </w:p>
-        </w:tc>
-        <w:tc>
-          <w:tcPr>
-            <w:tcW w:w="1336" w:type="dxa"/>
-          </w:tcPr>
-          <w:p>
-            <w:pPr>
-              <w:ind w:firstLine="0"/>
-              <w:jc w:val="left"/>
-            </w:pPr>
-            <w:r>
-              <w:rPr>
-                <w:color w:val="000000"/>
-                <w:sz w:val="24"/>
+            <w:tcW w:w="2438" w:type="dxa"/>
+          </w:tcPr>
+          <w:p>
+            <w:pPr>
+              <w:spacing w:line="240" w:lineRule="auto"/>
+              <w:ind w:firstLine="0"/>
+              <w:jc w:val="left"/>
+            </w:pPr>
+            <w:r>
+              <w:rPr>
+                <w:sz w:val="18"/>
+              </w:rPr>
+              <w:t>Кабинеты агента, менеджера и РОПа, каталог и защита сделки.</w:t>
+            </w:r>
+          </w:p>
+        </w:tc>
+        <w:tc>
+          <w:tcPr>
+            <w:tcW w:w="453" w:type="dxa"/>
+            <w:noWrap/>
+          </w:tcPr>
+          <w:p>
+            <w:pPr>
+              <w:spacing w:line="240" w:lineRule="auto"/>
+              <w:ind w:firstLine="0"/>
+              <w:jc w:val="center"/>
+            </w:pPr>
+            <w:r>
+              <w:rPr>
+                <w:sz w:val="18"/>
               </w:rPr>
               <w:t>X</w:t>
             </w:r>
@@ -6286,17 +6169,18 @@
         </w:tc>
         <w:tc>
           <w:tcPr>
-            <w:tcW w:w="1336" w:type="dxa"/>
-          </w:tcPr>
-          <w:p>
-            <w:pPr>
-              <w:ind w:firstLine="0"/>
-              <w:jc w:val="left"/>
-            </w:pPr>
-            <w:r>
-              <w:rPr>
-                <w:color w:val="000000"/>
-                <w:sz w:val="24"/>
+            <w:tcW w:w="453" w:type="dxa"/>
+            <w:noWrap/>
+          </w:tcPr>
+          <w:p>
+            <w:pPr>
+              <w:spacing w:line="240" w:lineRule="auto"/>
+              <w:ind w:firstLine="0"/>
+              <w:jc w:val="center"/>
+            </w:pPr>
+            <w:r>
+              <w:rPr>
+                <w:sz w:val="18"/>
               </w:rPr>
               <w:t>X</w:t>
             </w:r>
@@ -6304,39 +6188,43 @@
         </w:tc>
         <w:tc>
           <w:tcPr>
-            <w:tcW w:w="1336" w:type="dxa"/>
-          </w:tcPr>
-          <w:p>
-            <w:pPr>
-              <w:ind w:firstLine="0"/>
-              <w:jc w:val="left"/>
-            </w:pPr>
-          </w:p>
-        </w:tc>
-        <w:tc>
-          <w:tcPr>
-            <w:tcW w:w="1336" w:type="dxa"/>
-          </w:tcPr>
-          <w:p>
-            <w:pPr>
-              <w:ind w:firstLine="0"/>
-              <w:jc w:val="left"/>
-            </w:pPr>
-          </w:p>
-        </w:tc>
-        <w:tc>
-          <w:tcPr>
-            <w:tcW w:w="1336" w:type="dxa"/>
-          </w:tcPr>
-          <w:p>
-            <w:pPr>
-              <w:ind w:firstLine="0"/>
-              <w:jc w:val="left"/>
-            </w:pPr>
-            <w:r>
-              <w:rPr>
-                <w:color w:val="000000"/>
-                <w:sz w:val="24"/>
+            <w:tcW w:w="453" w:type="dxa"/>
+            <w:noWrap/>
+          </w:tcPr>
+          <w:p>
+            <w:pPr>
+              <w:spacing w:line="240" w:lineRule="auto"/>
+              <w:ind w:firstLine="0"/>
+              <w:jc w:val="center"/>
+            </w:pPr>
+          </w:p>
+        </w:tc>
+        <w:tc>
+          <w:tcPr>
+            <w:tcW w:w="453" w:type="dxa"/>
+            <w:noWrap/>
+          </w:tcPr>
+          <w:p>
+            <w:pPr>
+              <w:spacing w:line="240" w:lineRule="auto"/>
+              <w:ind w:firstLine="0"/>
+              <w:jc w:val="center"/>
+            </w:pPr>
+          </w:p>
+        </w:tc>
+        <w:tc>
+          <w:tcPr>
+            <w:tcW w:w="2381" w:type="dxa"/>
+          </w:tcPr>
+          <w:p>
+            <w:pPr>
+              <w:spacing w:line="240" w:lineRule="auto"/>
+              <w:ind w:firstLine="0"/>
+              <w:jc w:val="left"/>
+            </w:pPr>
+            <w:r>
+              <w:rPr>
+                <w:sz w:val="18"/>
               </w:rPr>
               <w:t>Рабочий прототип для демонстрации.</w:t>
             </w:r>
@@ -6349,72 +6237,67 @@
         </w:trPr>
         <w:tc>
           <w:tcPr>
-            <w:tcW w:w="1336" w:type="dxa"/>
-          </w:tcPr>
-          <w:p>
-            <w:pPr>
-              <w:ind w:firstLine="0"/>
-              <w:jc w:val="left"/>
-            </w:pPr>
-            <w:r>
-              <w:rPr>
-                <w:color w:val="000000"/>
-                <w:sz w:val="24"/>
-              </w:rPr>
-              <w:t>3. Демо-данные и тестирование</w:t>
-            </w:r>
-          </w:p>
-        </w:tc>
-        <w:tc>
-          <w:tcPr>
-            <w:tcW w:w="1336" w:type="dxa"/>
-          </w:tcPr>
-          <w:p>
-            <w:pPr>
-              <w:ind w:firstLine="0"/>
-              <w:jc w:val="left"/>
-            </w:pPr>
-            <w:r>
-              <w:rPr>
-                <w:color w:val="000000"/>
-                <w:sz w:val="24"/>
-              </w:rPr>
-              <w:t xml:space="preserve">Наполнение объектами, лидами, агентствами; </w:t>
-            </w:r>
-            <w:r>
-              <w:rPr>
-                <w:color w:val="000000"/>
-                <w:sz w:val="24"/>
-              </w:rPr>
-              <w:lastRenderedPageBreak/>
-              <w:t>проверка сценариев.</w:t>
-            </w:r>
-          </w:p>
-        </w:tc>
-        <w:tc>
-          <w:tcPr>
-            <w:tcW w:w="1336" w:type="dxa"/>
-          </w:tcPr>
-          <w:p>
-            <w:pPr>
-              <w:ind w:firstLine="0"/>
-              <w:jc w:val="left"/>
-            </w:pPr>
-          </w:p>
-        </w:tc>
-        <w:tc>
-          <w:tcPr>
-            <w:tcW w:w="1336" w:type="dxa"/>
-          </w:tcPr>
-          <w:p>
-            <w:pPr>
-              <w:ind w:firstLine="0"/>
-              <w:jc w:val="left"/>
-            </w:pPr>
-            <w:r>
-              <w:rPr>
-                <w:color w:val="000000"/>
-                <w:sz w:val="24"/>
+            <w:tcW w:w="1304" w:type="dxa"/>
+          </w:tcPr>
+          <w:p>
+            <w:pPr>
+              <w:spacing w:line="240" w:lineRule="auto"/>
+              <w:ind w:firstLine="0"/>
+              <w:jc w:val="left"/>
+            </w:pPr>
+            <w:r>
+              <w:rPr>
+                <w:sz w:val="18"/>
+              </w:rPr>
+              <w:t>3. Тестирование</w:t>
+            </w:r>
+          </w:p>
+        </w:tc>
+        <w:tc>
+          <w:tcPr>
+            <w:tcW w:w="2438" w:type="dxa"/>
+          </w:tcPr>
+          <w:p>
+            <w:pPr>
+              <w:spacing w:line="240" w:lineRule="auto"/>
+              <w:ind w:firstLine="0"/>
+              <w:jc w:val="left"/>
+            </w:pPr>
+            <w:r>
+              <w:rPr>
+                <w:sz w:val="18"/>
+              </w:rPr>
+              <w:t>Демо-данные: объекты, лиды, агентства; проверка сценариев.</w:t>
+            </w:r>
+          </w:p>
+        </w:tc>
+        <w:tc>
+          <w:tcPr>
+            <w:tcW w:w="453" w:type="dxa"/>
+            <w:noWrap/>
+          </w:tcPr>
+          <w:p>
+            <w:pPr>
+              <w:spacing w:line="240" w:lineRule="auto"/>
+              <w:ind w:firstLine="0"/>
+              <w:jc w:val="center"/>
+            </w:pPr>
+          </w:p>
+        </w:tc>
+        <w:tc>
+          <w:tcPr>
+            <w:tcW w:w="453" w:type="dxa"/>
+            <w:noWrap/>
+          </w:tcPr>
+          <w:p>
+            <w:pPr>
+              <w:spacing w:line="240" w:lineRule="auto"/>
+              <w:ind w:firstLine="0"/>
+              <w:jc w:val="center"/>
+            </w:pPr>
+            <w:r>
+              <w:rPr>
+                <w:sz w:val="18"/>
               </w:rPr>
               <w:t>X</w:t>
             </w:r>
@@ -6422,41 +6305,45 @@
         </w:tc>
         <w:tc>
           <w:tcPr>
-            <w:tcW w:w="1336" w:type="dxa"/>
-          </w:tcPr>
-          <w:p>
-            <w:pPr>
-              <w:ind w:firstLine="0"/>
-              <w:jc w:val="left"/>
-            </w:pPr>
-          </w:p>
-        </w:tc>
-        <w:tc>
-          <w:tcPr>
-            <w:tcW w:w="1336" w:type="dxa"/>
-          </w:tcPr>
-          <w:p>
-            <w:pPr>
-              <w:ind w:firstLine="0"/>
-              <w:jc w:val="left"/>
-            </w:pPr>
-          </w:p>
-        </w:tc>
-        <w:tc>
-          <w:tcPr>
-            <w:tcW w:w="1336" w:type="dxa"/>
-          </w:tcPr>
-          <w:p>
-            <w:pPr>
-              <w:ind w:firstLine="0"/>
-              <w:jc w:val="left"/>
-            </w:pPr>
-            <w:r>
-              <w:rPr>
-                <w:color w:val="000000"/>
-                <w:sz w:val="24"/>
-              </w:rPr>
-              <w:t>Проверенный MVP без критичных ошибок.</w:t>
+            <w:tcW w:w="453" w:type="dxa"/>
+            <w:noWrap/>
+          </w:tcPr>
+          <w:p>
+            <w:pPr>
+              <w:spacing w:line="240" w:lineRule="auto"/>
+              <w:ind w:firstLine="0"/>
+              <w:jc w:val="center"/>
+            </w:pPr>
+          </w:p>
+        </w:tc>
+        <w:tc>
+          <w:tcPr>
+            <w:tcW w:w="453" w:type="dxa"/>
+            <w:noWrap/>
+          </w:tcPr>
+          <w:p>
+            <w:pPr>
+              <w:spacing w:line="240" w:lineRule="auto"/>
+              <w:ind w:firstLine="0"/>
+              <w:jc w:val="center"/>
+            </w:pPr>
+          </w:p>
+        </w:tc>
+        <w:tc>
+          <w:tcPr>
+            <w:tcW w:w="2381" w:type="dxa"/>
+          </w:tcPr>
+          <w:p>
+            <w:pPr>
+              <w:spacing w:line="240" w:lineRule="auto"/>
+              <w:ind w:firstLine="0"/>
+              <w:jc w:val="left"/>
+            </w:pPr>
+            <w:r>
+              <w:rPr>
+                <w:sz w:val="18"/>
+              </w:rPr>
+              <w:t>MVP без критичных ошибок.</w:t>
             </w:r>
           </w:p>
         </w:tc>
@@ -6467,64 +6354,67 @@
         </w:trPr>
         <w:tc>
           <w:tcPr>
-            <w:tcW w:w="1336" w:type="dxa"/>
-          </w:tcPr>
-          <w:p>
-            <w:pPr>
-              <w:ind w:firstLine="0"/>
-              <w:jc w:val="left"/>
-            </w:pPr>
-            <w:r>
-              <w:rPr>
-                <w:color w:val="000000"/>
-                <w:sz w:val="24"/>
-              </w:rPr>
-              <w:t>4. Пилот с агентствами</w:t>
-            </w:r>
-          </w:p>
-        </w:tc>
-        <w:tc>
-          <w:tcPr>
-            <w:tcW w:w="1336" w:type="dxa"/>
-          </w:tcPr>
-          <w:p>
-            <w:pPr>
-              <w:ind w:firstLine="0"/>
-              <w:jc w:val="left"/>
-            </w:pPr>
-            <w:r>
-              <w:rPr>
-                <w:color w:val="000000"/>
-                <w:sz w:val="24"/>
-              </w:rPr>
-              <w:t>Подключение 5-10 партнеров, сбор обратной связи, корректировка интерфейса.</w:t>
-            </w:r>
-          </w:p>
-        </w:tc>
-        <w:tc>
-          <w:tcPr>
-            <w:tcW w:w="1336" w:type="dxa"/>
-          </w:tcPr>
-          <w:p>
-            <w:pPr>
-              <w:ind w:firstLine="0"/>
-              <w:jc w:val="left"/>
-            </w:pPr>
-          </w:p>
-        </w:tc>
-        <w:tc>
-          <w:tcPr>
-            <w:tcW w:w="1336" w:type="dxa"/>
-          </w:tcPr>
-          <w:p>
-            <w:pPr>
-              <w:ind w:firstLine="0"/>
-              <w:jc w:val="left"/>
-            </w:pPr>
-            <w:r>
-              <w:rPr>
-                <w:color w:val="000000"/>
-                <w:sz w:val="24"/>
+            <w:tcW w:w="1304" w:type="dxa"/>
+          </w:tcPr>
+          <w:p>
+            <w:pPr>
+              <w:spacing w:line="240" w:lineRule="auto"/>
+              <w:ind w:firstLine="0"/>
+              <w:jc w:val="left"/>
+            </w:pPr>
+            <w:r>
+              <w:rPr>
+                <w:sz w:val="18"/>
+              </w:rPr>
+              <w:t>4. Пилот</w:t>
+            </w:r>
+          </w:p>
+        </w:tc>
+        <w:tc>
+          <w:tcPr>
+            <w:tcW w:w="2438" w:type="dxa"/>
+          </w:tcPr>
+          <w:p>
+            <w:pPr>
+              <w:spacing w:line="240" w:lineRule="auto"/>
+              <w:ind w:firstLine="0"/>
+              <w:jc w:val="left"/>
+            </w:pPr>
+            <w:r>
+              <w:rPr>
+                <w:sz w:val="18"/>
+              </w:rPr>
+              <w:t>Подключение 5-10 агентств, сбор обратной связи, корректировка UX.</w:t>
+            </w:r>
+          </w:p>
+        </w:tc>
+        <w:tc>
+          <w:tcPr>
+            <w:tcW w:w="453" w:type="dxa"/>
+            <w:noWrap/>
+          </w:tcPr>
+          <w:p>
+            <w:pPr>
+              <w:spacing w:line="240" w:lineRule="auto"/>
+              <w:ind w:firstLine="0"/>
+              <w:jc w:val="center"/>
+            </w:pPr>
+          </w:p>
+        </w:tc>
+        <w:tc>
+          <w:tcPr>
+            <w:tcW w:w="453" w:type="dxa"/>
+            <w:noWrap/>
+          </w:tcPr>
+          <w:p>
+            <w:pPr>
+              <w:spacing w:line="240" w:lineRule="auto"/>
+              <w:ind w:firstLine="0"/>
+              <w:jc w:val="center"/>
+            </w:pPr>
+            <w:r>
+              <w:rPr>
+                <w:sz w:val="18"/>
               </w:rPr>
               <w:t>X</w:t>
             </w:r>
@@ -6532,17 +6422,18 @@
         </w:tc>
         <w:tc>
           <w:tcPr>
-            <w:tcW w:w="1336" w:type="dxa"/>
-          </w:tcPr>
-          <w:p>
-            <w:pPr>
-              <w:ind w:firstLine="0"/>
-              <w:jc w:val="left"/>
-            </w:pPr>
-            <w:r>
-              <w:rPr>
-                <w:color w:val="000000"/>
-                <w:sz w:val="24"/>
+            <w:tcW w:w="453" w:type="dxa"/>
+            <w:noWrap/>
+          </w:tcPr>
+          <w:p>
+            <w:pPr>
+              <w:spacing w:line="240" w:lineRule="auto"/>
+              <w:ind w:firstLine="0"/>
+              <w:jc w:val="center"/>
+            </w:pPr>
+            <w:r>
+              <w:rPr>
+                <w:sz w:val="18"/>
               </w:rPr>
               <w:t>X</w:t>
             </w:r>
@@ -6550,28 +6441,30 @@
         </w:tc>
         <w:tc>
           <w:tcPr>
-            <w:tcW w:w="1336" w:type="dxa"/>
-          </w:tcPr>
-          <w:p>
-            <w:pPr>
-              <w:ind w:firstLine="0"/>
-              <w:jc w:val="left"/>
-            </w:pPr>
-          </w:p>
-        </w:tc>
-        <w:tc>
-          <w:tcPr>
-            <w:tcW w:w="1336" w:type="dxa"/>
-          </w:tcPr>
-          <w:p>
-            <w:pPr>
-              <w:ind w:firstLine="0"/>
-              <w:jc w:val="left"/>
-            </w:pPr>
-            <w:r>
-              <w:rPr>
-                <w:color w:val="000000"/>
-                <w:sz w:val="24"/>
+            <w:tcW w:w="453" w:type="dxa"/>
+            <w:noWrap/>
+          </w:tcPr>
+          <w:p>
+            <w:pPr>
+              <w:spacing w:line="240" w:lineRule="auto"/>
+              <w:ind w:firstLine="0"/>
+              <w:jc w:val="center"/>
+            </w:pPr>
+          </w:p>
+        </w:tc>
+        <w:tc>
+          <w:tcPr>
+            <w:tcW w:w="2381" w:type="dxa"/>
+          </w:tcPr>
+          <w:p>
+            <w:pPr>
+              <w:spacing w:line="240" w:lineRule="auto"/>
+              <w:ind w:firstLine="0"/>
+              <w:jc w:val="left"/>
+            </w:pPr>
+            <w:r>
+              <w:rPr>
+                <w:sz w:val="18"/>
               </w:rPr>
               <w:t>Подтверждение удобства и регламентов.</w:t>
             </w:r>
@@ -6584,17 +6477,17 @@
         </w:trPr>
         <w:tc>
           <w:tcPr>
-            <w:tcW w:w="1336" w:type="dxa"/>
-          </w:tcPr>
-          <w:p>
-            <w:pPr>
-              <w:ind w:firstLine="0"/>
-              <w:jc w:val="left"/>
-            </w:pPr>
-            <w:r>
-              <w:rPr>
-                <w:color w:val="000000"/>
-                <w:sz w:val="24"/>
+            <w:tcW w:w="1304" w:type="dxa"/>
+          </w:tcPr>
+          <w:p>
+            <w:pPr>
+              <w:spacing w:line="240" w:lineRule="auto"/>
+              <w:ind w:firstLine="0"/>
+              <w:jc w:val="left"/>
+            </w:pPr>
+            <w:r>
+              <w:rPr>
+                <w:sz w:val="18"/>
               </w:rPr>
               <w:t>5. Интеграции</w:t>
             </w:r>
@@ -6602,57 +6495,62 @@
         </w:tc>
         <w:tc>
           <w:tcPr>
-            <w:tcW w:w="1336" w:type="dxa"/>
-          </w:tcPr>
-          <w:p>
-            <w:pPr>
-              <w:ind w:firstLine="0"/>
-              <w:jc w:val="left"/>
-            </w:pPr>
-            <w:r>
-              <w:rPr>
-                <w:color w:val="000000"/>
-                <w:sz w:val="24"/>
-              </w:rPr>
-              <w:t>Подключение Bitrix24 REST API, синхронизация статусов Profitbase.</w:t>
-            </w:r>
-          </w:p>
-        </w:tc>
-        <w:tc>
-          <w:tcPr>
-            <w:tcW w:w="1336" w:type="dxa"/>
-          </w:tcPr>
-          <w:p>
-            <w:pPr>
-              <w:ind w:firstLine="0"/>
-              <w:jc w:val="left"/>
-            </w:pPr>
-          </w:p>
-        </w:tc>
-        <w:tc>
-          <w:tcPr>
-            <w:tcW w:w="1336" w:type="dxa"/>
-          </w:tcPr>
-          <w:p>
-            <w:pPr>
-              <w:ind w:firstLine="0"/>
-              <w:jc w:val="left"/>
-            </w:pPr>
-          </w:p>
-        </w:tc>
-        <w:tc>
-          <w:tcPr>
-            <w:tcW w:w="1336" w:type="dxa"/>
-          </w:tcPr>
-          <w:p>
-            <w:pPr>
-              <w:ind w:firstLine="0"/>
-              <w:jc w:val="left"/>
-            </w:pPr>
-            <w:r>
-              <w:rPr>
-                <w:color w:val="000000"/>
-                <w:sz w:val="24"/>
+            <w:tcW w:w="2438" w:type="dxa"/>
+          </w:tcPr>
+          <w:p>
+            <w:pPr>
+              <w:spacing w:line="240" w:lineRule="auto"/>
+              <w:ind w:firstLine="0"/>
+              <w:jc w:val="left"/>
+            </w:pPr>
+            <w:r>
+              <w:rPr>
+                <w:sz w:val="18"/>
+              </w:rPr>
+              <w:t>Bitrix24 REST API, синхронизация статусов Profitbase.</w:t>
+            </w:r>
+          </w:p>
+        </w:tc>
+        <w:tc>
+          <w:tcPr>
+            <w:tcW w:w="453" w:type="dxa"/>
+            <w:noWrap/>
+          </w:tcPr>
+          <w:p>
+            <w:pPr>
+              <w:spacing w:line="240" w:lineRule="auto"/>
+              <w:ind w:firstLine="0"/>
+              <w:jc w:val="center"/>
+            </w:pPr>
+          </w:p>
+        </w:tc>
+        <w:tc>
+          <w:tcPr>
+            <w:tcW w:w="453" w:type="dxa"/>
+            <w:noWrap/>
+          </w:tcPr>
+          <w:p>
+            <w:pPr>
+              <w:spacing w:line="240" w:lineRule="auto"/>
+              <w:ind w:firstLine="0"/>
+              <w:jc w:val="center"/>
+            </w:pPr>
+          </w:p>
+        </w:tc>
+        <w:tc>
+          <w:tcPr>
+            <w:tcW w:w="453" w:type="dxa"/>
+            <w:noWrap/>
+          </w:tcPr>
+          <w:p>
+            <w:pPr>
+              <w:spacing w:line="240" w:lineRule="auto"/>
+              <w:ind w:firstLine="0"/>
+              <w:jc w:val="center"/>
+            </w:pPr>
+            <w:r>
+              <w:rPr>
+                <w:sz w:val="18"/>
               </w:rPr>
               <w:t>X</w:t>
             </w:r>
@@ -6660,17 +6558,18 @@
         </w:tc>
         <w:tc>
           <w:tcPr>
-            <w:tcW w:w="1336" w:type="dxa"/>
-          </w:tcPr>
-          <w:p>
-            <w:pPr>
-              <w:ind w:firstLine="0"/>
-              <w:jc w:val="left"/>
-            </w:pPr>
-            <w:r>
-              <w:rPr>
-                <w:color w:val="000000"/>
-                <w:sz w:val="24"/>
+            <w:tcW w:w="453" w:type="dxa"/>
+            <w:noWrap/>
+          </w:tcPr>
+          <w:p>
+            <w:pPr>
+              <w:spacing w:line="240" w:lineRule="auto"/>
+              <w:ind w:firstLine="0"/>
+              <w:jc w:val="center"/>
+            </w:pPr>
+            <w:r>
+              <w:rPr>
+                <w:sz w:val="18"/>
               </w:rPr>
               <w:t>X</w:t>
             </w:r>
@@ -6678,17 +6577,17 @@
         </w:tc>
         <w:tc>
           <w:tcPr>
-            <w:tcW w:w="1336" w:type="dxa"/>
-          </w:tcPr>
-          <w:p>
-            <w:pPr>
-              <w:ind w:firstLine="0"/>
-              <w:jc w:val="left"/>
-            </w:pPr>
-            <w:r>
-              <w:rPr>
-                <w:color w:val="000000"/>
-                <w:sz w:val="24"/>
+            <w:tcW w:w="2381" w:type="dxa"/>
+          </w:tcPr>
+          <w:p>
+            <w:pPr>
+              <w:spacing w:line="240" w:lineRule="auto"/>
+              <w:ind w:firstLine="0"/>
+              <w:jc w:val="left"/>
+            </w:pPr>
+            <w:r>
+              <w:rPr>
+                <w:sz w:val="18"/>
               </w:rPr>
               <w:t>Обмен данными с базовыми системами.</w:t>
             </w:r>
@@ -6701,35 +6600,35 @@
         </w:trPr>
         <w:tc>
           <w:tcPr>
-            <w:tcW w:w="1336" w:type="dxa"/>
-          </w:tcPr>
-          <w:p>
-            <w:pPr>
-              <w:ind w:firstLine="0"/>
-              <w:jc w:val="left"/>
-            </w:pPr>
-            <w:r>
-              <w:rPr>
-                <w:color w:val="000000"/>
-                <w:sz w:val="24"/>
-              </w:rPr>
-              <w:t>6. Промышленный запуск</w:t>
-            </w:r>
-          </w:p>
-        </w:tc>
-        <w:tc>
-          <w:tcPr>
-            <w:tcW w:w="1336" w:type="dxa"/>
-          </w:tcPr>
-          <w:p>
-            <w:pPr>
-              <w:ind w:firstLine="0"/>
-              <w:jc w:val="left"/>
-            </w:pPr>
-            <w:r>
-              <w:rPr>
-                <w:color w:val="000000"/>
-                <w:sz w:val="24"/>
+            <w:tcW w:w="1304" w:type="dxa"/>
+          </w:tcPr>
+          <w:p>
+            <w:pPr>
+              <w:spacing w:line="240" w:lineRule="auto"/>
+              <w:ind w:firstLine="0"/>
+              <w:jc w:val="left"/>
+            </w:pPr>
+            <w:r>
+              <w:rPr>
+                <w:sz w:val="18"/>
+              </w:rPr>
+              <w:t>6. Запуск</w:t>
+            </w:r>
+          </w:p>
+        </w:tc>
+        <w:tc>
+          <w:tcPr>
+            <w:tcW w:w="2438" w:type="dxa"/>
+          </w:tcPr>
+          <w:p>
+            <w:pPr>
+              <w:spacing w:line="240" w:lineRule="auto"/>
+              <w:ind w:firstLine="0"/>
+              <w:jc w:val="left"/>
+            </w:pPr>
+            <w:r>
+              <w:rPr>
+                <w:sz w:val="18"/>
               </w:rPr>
               <w:t>Обучение менеджеров и агентств, KPI-регламент, поддержка.</w:t>
             </w:r>
@@ -6737,50 +6636,57 @@
         </w:tc>
         <w:tc>
           <w:tcPr>
-            <w:tcW w:w="1336" w:type="dxa"/>
-          </w:tcPr>
-          <w:p>
-            <w:pPr>
-              <w:ind w:firstLine="0"/>
-              <w:jc w:val="left"/>
-            </w:pPr>
-          </w:p>
-        </w:tc>
-        <w:tc>
-          <w:tcPr>
-            <w:tcW w:w="1336" w:type="dxa"/>
-          </w:tcPr>
-          <w:p>
-            <w:pPr>
-              <w:ind w:firstLine="0"/>
-              <w:jc w:val="left"/>
-            </w:pPr>
-          </w:p>
-        </w:tc>
-        <w:tc>
-          <w:tcPr>
-            <w:tcW w:w="1336" w:type="dxa"/>
-          </w:tcPr>
-          <w:p>
-            <w:pPr>
-              <w:ind w:firstLine="0"/>
-              <w:jc w:val="left"/>
-            </w:pPr>
-          </w:p>
-        </w:tc>
-        <w:tc>
-          <w:tcPr>
-            <w:tcW w:w="1336" w:type="dxa"/>
-          </w:tcPr>
-          <w:p>
-            <w:pPr>
-              <w:ind w:firstLine="0"/>
-              <w:jc w:val="left"/>
-            </w:pPr>
-            <w:r>
-              <w:rPr>
-                <w:color w:val="000000"/>
-                <w:sz w:val="24"/>
+            <w:tcW w:w="453" w:type="dxa"/>
+            <w:noWrap/>
+          </w:tcPr>
+          <w:p>
+            <w:pPr>
+              <w:spacing w:line="240" w:lineRule="auto"/>
+              <w:ind w:firstLine="0"/>
+              <w:jc w:val="center"/>
+            </w:pPr>
+          </w:p>
+        </w:tc>
+        <w:tc>
+          <w:tcPr>
+            <w:tcW w:w="453" w:type="dxa"/>
+            <w:noWrap/>
+          </w:tcPr>
+          <w:p>
+            <w:pPr>
+              <w:spacing w:line="240" w:lineRule="auto"/>
+              <w:ind w:firstLine="0"/>
+              <w:jc w:val="center"/>
+            </w:pPr>
+          </w:p>
+        </w:tc>
+        <w:tc>
+          <w:tcPr>
+            <w:tcW w:w="453" w:type="dxa"/>
+            <w:noWrap/>
+          </w:tcPr>
+          <w:p>
+            <w:pPr>
+              <w:spacing w:line="240" w:lineRule="auto"/>
+              <w:ind w:firstLine="0"/>
+              <w:jc w:val="center"/>
+            </w:pPr>
+          </w:p>
+        </w:tc>
+        <w:tc>
+          <w:tcPr>
+            <w:tcW w:w="453" w:type="dxa"/>
+            <w:noWrap/>
+          </w:tcPr>
+          <w:p>
+            <w:pPr>
+              <w:spacing w:line="240" w:lineRule="auto"/>
+              <w:ind w:firstLine="0"/>
+              <w:jc w:val="center"/>
+            </w:pPr>
+            <w:r>
+              <w:rPr>
+                <w:sz w:val="18"/>
               </w:rPr>
               <w:t>X</w:t>
             </w:r>
@@ -6788,19 +6694,19 @@
         </w:tc>
         <w:tc>
           <w:tcPr>
-            <w:tcW w:w="1336" w:type="dxa"/>
-          </w:tcPr>
-          <w:p>
-            <w:pPr>
-              <w:ind w:firstLine="0"/>
-              <w:jc w:val="left"/>
-            </w:pPr>
-            <w:r>
-              <w:rPr>
-                <w:color w:val="000000"/>
-                <w:sz w:val="24"/>
-              </w:rPr>
-              <w:t>Переход к регулярной эксплуатации.</w:t>
+            <w:tcW w:w="2381" w:type="dxa"/>
+          </w:tcPr>
+          <w:p>
+            <w:pPr>
+              <w:spacing w:line="240" w:lineRule="auto"/>
+              <w:ind w:firstLine="0"/>
+              <w:jc w:val="left"/>
+            </w:pPr>
+            <w:r>
+              <w:rPr>
+                <w:sz w:val="18"/>
+              </w:rPr>
+              <w:t>Регулярная эксплуатация.</w:t>
             </w:r>
           </w:p>
         </w:tc>
@@ -6812,16 +6718,22 @@
         <w:pStyle w:val="21"/>
       </w:pPr>
       <w:r>
+        <w:t>3.6. Ожидаемые результаты внедрения и экономический эффект</w:t>
+      </w:r>
+    </w:p>
+    <w:p>
+      <w:r>
+        <w:rPr>
+          <w:color w:val="000000"/>
+        </w:rPr>
+        <w:t xml:space="preserve">Экономический эффект проекта формируется не только за счет прямого роста выручки, но и за счет снижения управленческих потерь. Портал уменьшает время на ручную обработку запросов, снижает вероятность потери теплого клиента, повышает прозрачность агентского канала и позволяет </w:t>
+      </w:r>
+      <w:r>
+        <w:rPr>
+          <w:color w:val="000000"/>
+        </w:rPr>
         <w:lastRenderedPageBreak/>
-        <w:t>3.6. Ожидаемые результаты внедрения и экономический эффект</w:t>
-      </w:r>
-    </w:p>
-    <w:p>
-      <w:r>
-        <w:rPr>
-          <w:color w:val="000000"/>
-        </w:rPr>
-        <w:t>Экономический эффект проекта формируется не только за счет прямого роста выручки, но и за счет снижения управленческих потерь. Портал уменьшает время на ручную обработку запросов, снижает вероятность потери теплого клиента, повышает прозрачность агентского канала и позволяет перераспределить маркетинговый бюджет в пользу каналов с оплатой за результат.</w:t>
+        <w:t>перераспределить маркетинговый бюджет в пользу каналов с оплатой за результат.</w:t>
       </w:r>
     </w:p>
     <w:p>
@@ -7042,7 +6954,6 @@
                 <w:color w:val="000000"/>
                 <w:sz w:val="24"/>
               </w:rPr>
-              <w:lastRenderedPageBreak/>
               <w:t>Конверсия лидов в продажи</w:t>
             </w:r>
           </w:p>
@@ -7274,6 +7185,7 @@
                 <w:color w:val="000000"/>
                 <w:sz w:val="24"/>
               </w:rPr>
+              <w:lastRenderedPageBreak/>
               <w:t>Управленческая отчетность</w:t>
             </w:r>
           </w:p>
@@ -7801,24 +7713,30 @@
         <w:pStyle w:val="21"/>
       </w:pPr>
       <w:r>
+        <w:t>3.7. MVP Resource Partner AI для демонстрации на защите</w:t>
+      </w:r>
+    </w:p>
+    <w:p>
+      <w:r>
+        <w:rPr>
+          <w:color w:val="000000"/>
+        </w:rPr>
+        <w:t>Наличие демонстрируемого MVP усиливает практическую ценность работы, поскольку проектная часть перестает быть только концепцией. MVP показывает, как предложенная модель может работать в реальном интерфейсе: агент заходит в личный кабинет, выбирает объект, регистрирует клиента, фиксирует интерес к квартире, а РОП видит агрегированные показатели партнерской сети.</w:t>
+      </w:r>
+    </w:p>
+    <w:p>
+      <w:r>
+        <w:rPr>
+          <w:color w:val="000000"/>
+        </w:rPr>
+        <w:t xml:space="preserve">Реализованный Python-сценарий соответствует логике быстрого прототипирования. В отличие от тяжелого корпоративного внедрения, MVP </w:t>
+      </w:r>
+      <w:r>
+        <w:rPr>
+          <w:color w:val="000000"/>
+        </w:rPr>
         <w:lastRenderedPageBreak/>
-        <w:t>3.7. MVP Resource Partner AI для демонстрации на защите</w:t>
-      </w:r>
-    </w:p>
-    <w:p>
-      <w:r>
-        <w:rPr>
-          <w:color w:val="000000"/>
-        </w:rPr>
-        <w:t>Наличие демонстрируемого MVP усиливает практическую ценность работы, поскольку проектная часть перестает быть только концепцией. MVP показывает, как предложенная модель может работать в реальном интерфейсе: агент заходит в личный кабинет, выбирает объект, регистрирует клиента, фиксирует интерес к квартире, а РОП видит агрегированные показатели партнерской сети.</w:t>
-      </w:r>
-    </w:p>
-    <w:p>
-      <w:r>
-        <w:rPr>
-          <w:color w:val="000000"/>
-        </w:rPr>
-        <w:t>Реализованный Python-сценарий соответствует логике быстрого прототипирования. В отличие от тяжелого корпоративного внедрения, MVP позволяет проверить гипотезу и получить обратную связь до существенных затрат. При положительном результате прототип может быть развит в промышленный продукт: подключить реальные API, добавить уведомления, расширить аналитику, ввести журнал аудита и подключить AI-модуль для рекомендаций.</w:t>
+        <w:t>позволяет проверить гипотезу и получить обратную связь до существенных затрат. При положительном результате прототип может быть развит в промышленный продукт: подключить реальные API, добавить уведомления, расширить аналитику, ввести журнал аудита и подключить AI-модуль для рекомендаций.</w:t>
       </w:r>
     </w:p>
     <w:p>
@@ -8052,7 +7970,6 @@
                 <w:color w:val="000000"/>
                 <w:sz w:val="24"/>
               </w:rPr>
-              <w:lastRenderedPageBreak/>
               <w:t>Форма защиты сделки</w:t>
             </w:r>
           </w:p>
@@ -8219,7 +8136,14 @@
         <w:rPr>
           <w:color w:val="000000"/>
         </w:rPr>
-        <w:t>Вывод по главе 3. Сравнение инструментов показало, что для ГК «Ресурс» оптимальна не замена CRM, а разработка B2B AI SaaS-надстройки над существующими Bitrix24 и Profitbase. Resource Partner AI позволяет совместить партнерский кабинет, автоматизацию защиты сделки, каталог объектов, KPI-аналитику и перспективу AI-подсказок. Предложенный план внедрения реалистичен для пилота, а ожидаемый эффект подтверждает экономическую целесообразность проекта.</w:t>
+        <w:t xml:space="preserve">Вывод по главе 3. Сравнение инструментов показало, что для ГК «Ресурс» оптимальна не замена CRM, а разработка B2B AI SaaS-надстройки над существующими Bitrix24 и Profitbase. Resource Partner AI позволяет совместить партнерский кабинет, автоматизацию защиты сделки, каталог объектов, KPI-аналитику и перспективу AI-подсказок. Предложенный план </w:t>
+      </w:r>
+      <w:r>
+        <w:rPr>
+          <w:color w:val="000000"/>
+        </w:rPr>
+        <w:lastRenderedPageBreak/>
+        <w:t>внедрения реалистичен для пилота, а ожидаемый эффект подтверждает экономическую целесообразность проекта.</w:t>
       </w:r>
     </w:p>
     <w:p>
@@ -8342,12 +8266,48 @@
     <w:p>
       <w:pPr>
         <w:ind w:firstLine="0"/>
-      </w:pPr>
-      <w:r>
-        <w:rPr>
-          <w:color w:val="000000"/>
-        </w:rPr>
-        <w:t>Указ Президента Российской Федерации от 15.02.2024 № 124 «О внесении изменений в Указ Президента Российской Федерации от 10 октября 2019 г. № 490...» // Официальное опубликование правовых актов. URL: https://publication.pravo.gov.ru/document/0001202402150063 (дата обращения: 19.05.2026).</w:t>
+        <w:rPr>
+          <w:lang w:val="en-US"/>
+        </w:rPr>
+      </w:pPr>
+      <w:r>
+        <w:rPr>
+          <w:color w:val="000000"/>
+        </w:rPr>
+        <w:t xml:space="preserve">Указ Президента Российской Федерации от 15.02.2024 № 124 «О внесении изменений в Указ Президента Российской Федерации от 10 октября 2019 г. № 490...» // Официальное опубликование правовых актов. </w:t>
+      </w:r>
+      <w:r>
+        <w:rPr>
+          <w:color w:val="000000"/>
+          <w:lang w:val="en-US"/>
+        </w:rPr>
+        <w:t>URL: https://publication.pravo.gov.ru/document/0001202402150063 (</w:t>
+      </w:r>
+      <w:r>
+        <w:rPr>
+          <w:color w:val="000000"/>
+        </w:rPr>
+        <w:t>дата</w:t>
+      </w:r>
+      <w:r>
+        <w:rPr>
+          <w:color w:val="000000"/>
+          <w:lang w:val="en-US"/>
+        </w:rPr>
+        <w:t xml:space="preserve"> </w:t>
+      </w:r>
+      <w:r>
+        <w:rPr>
+          <w:color w:val="000000"/>
+        </w:rPr>
+        <w:t>обращения</w:t>
+      </w:r>
+      <w:r>
+        <w:rPr>
+          <w:color w:val="000000"/>
+          <w:lang w:val="en-US"/>
+        </w:rPr>
+        <w:t>: 19.05.2026).</w:t>
       </w:r>
     </w:p>
     <w:p>
@@ -8357,8 +8317,15 @@
       <w:r>
         <w:rPr>
           <w:color w:val="000000"/>
-        </w:rPr>
-        <w:t>Overview of REST API 3.0 // Bitrix24 REST API and Marketplace Applications. URL: https://apidocs.bitrix24.com/api-reference/rest-v3/index.html (дата обращения: 19.05.2026).</w:t>
+          <w:lang w:val="en-US"/>
+        </w:rPr>
+        <w:t xml:space="preserve">Overview of REST API 3.0 // Bitrix24 REST API and Marketplace Applications. </w:t>
+      </w:r>
+      <w:r>
+        <w:rPr>
+          <w:color w:val="000000"/>
+        </w:rPr>
+        <w:t>URL: https://apidocs.bitrix24.com/api-reference/rest-v3/index.html (дата обращения: 19.05.2026).</w:t>
       </w:r>
     </w:p>
     <w:p>
@@ -8368,8 +8335,15 @@
       <w:r>
         <w:rPr>
           <w:color w:val="000000"/>
-        </w:rPr>
-        <w:t>Bitrix24 plans and pricing // Bitrix24. URL: https://www.bitrix24.com/prices/ (дата обращения: 19.05.2026).</w:t>
+          <w:lang w:val="en-US"/>
+        </w:rPr>
+        <w:t xml:space="preserve">Bitrix24 plans and pricing // Bitrix24. </w:t>
+      </w:r>
+      <w:r>
+        <w:rPr>
+          <w:color w:val="000000"/>
+        </w:rPr>
+        <w:t>URL: https://www.bitrix24.com/prices/ (дата обращения: 19.05.2026).</w:t>
       </w:r>
     </w:p>
     <w:p>
@@ -8397,12 +8371,42 @@
     <w:p>
       <w:pPr>
         <w:ind w:firstLine="0"/>
-      </w:pPr>
-      <w:r>
-        <w:rPr>
-          <w:color w:val="000000"/>
-        </w:rPr>
-        <w:t>CRM for property developers // Profitbase.Global. URL: https://profitbase.global/en/crm (дата обращения: 19.05.2026).</w:t>
+        <w:rPr>
+          <w:lang w:val="en-US"/>
+        </w:rPr>
+      </w:pPr>
+      <w:r>
+        <w:rPr>
+          <w:color w:val="000000"/>
+          <w:lang w:val="en-US"/>
+        </w:rPr>
+        <w:t>CRM for property developers // Profitbase.Global. URL: https://profitbase.global/en/crm (</w:t>
+      </w:r>
+      <w:r>
+        <w:rPr>
+          <w:color w:val="000000"/>
+        </w:rPr>
+        <w:t>дата</w:t>
+      </w:r>
+      <w:r>
+        <w:rPr>
+          <w:color w:val="000000"/>
+          <w:lang w:val="en-US"/>
+        </w:rPr>
+        <w:t xml:space="preserve"> </w:t>
+      </w:r>
+      <w:r>
+        <w:rPr>
+          <w:color w:val="000000"/>
+        </w:rPr>
+        <w:t>обращения</w:t>
+      </w:r>
+      <w:r>
+        <w:rPr>
+          <w:color w:val="000000"/>
+          <w:lang w:val="en-US"/>
+        </w:rPr>
+        <w:t>: 19.05.2026).</w:t>
       </w:r>
     </w:p>
     <w:p>
@@ -8412,20 +8416,57 @@
       <w:r>
         <w:rPr>
           <w:color w:val="000000"/>
-        </w:rPr>
-        <w:t>Django at a glance // Django documentation. URL: https://docs.djangoproject.com/en/5.2/intro/overview/ (дата обращения: 19.05.2026).</w:t>
+          <w:lang w:val="en-US"/>
+        </w:rPr>
+        <w:t xml:space="preserve">Django at a glance // Django documentation. </w:t>
+      </w:r>
+      <w:r>
+        <w:rPr>
+          <w:color w:val="000000"/>
+        </w:rPr>
+        <w:t>URL: https://docs.djangoproject.com/en/5.2/intro/overview/ (дата обращения: 19.05.2026).</w:t>
       </w:r>
     </w:p>
     <w:p>
       <w:pPr>
         <w:ind w:firstLine="0"/>
-      </w:pPr>
-      <w:r>
-        <w:rPr>
-          <w:color w:val="000000"/>
+        <w:rPr>
+          <w:lang w:val="en-US"/>
+        </w:rPr>
+      </w:pPr>
+      <w:r>
+        <w:rPr>
+          <w:color w:val="000000"/>
+          <w:lang w:val="en-US"/>
         </w:rPr>
         <w:lastRenderedPageBreak/>
-        <w:t>Chart.js documentation // Chart.js. URL: https://www.chartjs.org/docs/latest/ (дата обращения: 19.05.2026).</w:t>
+        <w:t>Chart.js documentation // Chart.js. URL: https://www.chartjs.org/docs/latest/ (</w:t>
+      </w:r>
+      <w:r>
+        <w:rPr>
+          <w:color w:val="000000"/>
+        </w:rPr>
+        <w:t>дата</w:t>
+      </w:r>
+      <w:r>
+        <w:rPr>
+          <w:color w:val="000000"/>
+          <w:lang w:val="en-US"/>
+        </w:rPr>
+        <w:t xml:space="preserve"> </w:t>
+      </w:r>
+      <w:r>
+        <w:rPr>
+          <w:color w:val="000000"/>
+        </w:rPr>
+        <w:t>обращения</w:t>
+      </w:r>
+      <w:r>
+        <w:rPr>
+          <w:color w:val="000000"/>
+          <w:lang w:val="en-US"/>
+        </w:rPr>
+        <w:t>: 19.05.2026).</w:t>
       </w:r>
     </w:p>
     <w:p>
@@ -8696,11 +8737,15 @@
             <w:pPr>
               <w:ind w:firstLine="0"/>
               <w:jc w:val="left"/>
-            </w:pPr>
-            <w:r>
-              <w:rPr>
-                <w:color w:val="000000"/>
-                <w:sz w:val="24"/>
+              <w:rPr>
+                <w:lang w:val="en-US"/>
+              </w:rPr>
+            </w:pPr>
+            <w:r>
+              <w:rPr>
+                <w:color w:val="000000"/>
+                <w:sz w:val="24"/>
+                <w:lang w:val="en-US"/>
               </w:rPr>
               <w:t>portal/management/commands/seed_demo.py</w:t>
             </w:r>
@@ -8737,11 +8782,15 @@
             <w:pPr>
               <w:ind w:firstLine="0"/>
               <w:jc w:val="left"/>
-            </w:pPr>
-            <w:r>
-              <w:rPr>
-                <w:color w:val="000000"/>
-                <w:sz w:val="24"/>
+              <w:rPr>
+                <w:lang w:val="en-US"/>
+              </w:rPr>
+            </w:pPr>
+            <w:r>
+              <w:rPr>
+                <w:color w:val="000000"/>
+                <w:sz w:val="24"/>
+                <w:lang w:val="en-US"/>
               </w:rPr>
               <w:t>portal/static/portal/styles.css</w:t>
             </w:r>
@@ -9500,7 +9549,11 @@
 
 <file path=word/footer1.xml><?xml version="1.0" encoding="utf-8"?>
 <w:ftr xmlns:wpc="http://schemas.microsoft.com/office/word/2010/wordprocessingCanvas" xmlns:cx="http://schemas.microsoft.com/office/drawing/2014/chartex" xmlns:cx1="http://schemas.microsoft.com/office/drawing/2015/9/8/chartex" xmlns:cx2="http://schemas.microsoft.com/office/drawing/2015/10/21/chartex" xmlns:cx3="http://schemas.microsoft.com/office/drawing/2016/5/9/chartex" xmlns:cx4="http://schemas.microsoft.com/office/drawing/2016/5/10/chartex" xmlns:cx5="http://schemas.microsoft.com/office/drawing/2016/5/11/chartex" xmlns:cx6="http://schemas.microsoft.com/office/drawing/2016/5/12/chartex" xmlns:cx7="http://schemas.microsoft.com/office/drawing/2016/5/13/chartex" xmlns:cx8="http://schemas.microsoft.com/office/drawing/2016/5/14/chartex" xmlns:mc="http://schemas.openxmlformats.org/markup-compatibility/2006" xmlns:aink="http://schemas.microsoft.com/office/drawing/2016/ink" xmlns:am3d="http://schemas.microsoft.com/office/drawing/2017/model3d" xmlns:o="urn:schemas-microsoft-com:office:office" xmlns:oel="http://schemas.microsoft.com/office/2019/extlst" xmlns:r="http://schemas.openxmlformats.org/officeDocument/2006/relationships" xmlns:m="http://schemas.openxmlformats.org/officeDocument/2006/math" xmlns:v="urn:schemas-microsoft-com:vml" xmlns:wp14="http://schemas.microsoft.com/office/word/2010/wordprocessingDrawing" xmlns:wp="http://schemas.openxmlformats.org/drawingml/2006/wordprocessingDrawing" xmlns:w10="urn:schemas-microsoft-com:office:word" xmlns:w="http://schemas.openxmlformats.org/wordprocessingml/2006/main" xmlns:w14="http://schemas.microsoft.com/office/word/2010/wordml" xmlns:w15="http://schemas.microsoft.com/office/word/2012/wordml" xmlns:w16cex="http://schemas.microsoft.com/office/word/2018/wordml/cex" xmlns:w16cid="http://schemas.microsoft.com/office/word/2016/wordml/cid" xmlns:w16="http://schemas.microsoft.com/office/word/2018/wordml" xmlns:w16du="http://schemas.microsoft.com/office/word/2023/wordml/word16du" xmlns:w16sdtdh="http://schemas.microsoft.com/office/word/2020/wordml/sdtdatahash" xmlns:w16sdtfl="http://schemas.microsoft.com/office/word/2024/wordml/sdtformatlock" xmlns:w16se="http://schemas.microsoft.com/office/word/2015/wordml/symex" xmlns:wpg="http://schemas.microsoft.com/office/word/2010/wordprocessingGroup" xmlns:wpi="http://schemas.microsoft.com/office/word/2010/wordprocessingInk" xmlns:wne="http://schemas.microsoft.com/office/word/2006/wordml" xmlns:wps="http://schemas.microsoft.com/office/word/2010/wordprocessingShape" mc:Ignorable="w14 w15 w16se w16cid w16 w16cex w16sdtdh w16sdtfl w16du wp14">
-  <w:p/>
+  <w:p>
+    <w:pPr>
+      <w:pStyle w:val="a9"/>
+    </w:pPr>
+  </w:p>
 </w:ftr>
 </file>
 
@@ -9535,7 +9588,11 @@
 
 <file path=word/footer3.xml><?xml version="1.0" encoding="utf-8"?>
 <w:ftr xmlns:wpc="http://schemas.microsoft.com/office/word/2010/wordprocessingCanvas" xmlns:cx="http://schemas.microsoft.com/office/drawing/2014/chartex" xmlns:cx1="http://schemas.microsoft.com/office/drawing/2015/9/8/chartex" xmlns:cx2="http://schemas.microsoft.com/office/drawing/2015/10/21/chartex" xmlns:cx3="http://schemas.microsoft.com/office/drawing/2016/5/9/chartex" xmlns:cx4="http://schemas.microsoft.com/office/drawing/2016/5/10/chartex" xmlns:cx5="http://schemas.microsoft.com/office/drawing/2016/5/11/chartex" xmlns:cx6="http://schemas.microsoft.com/office/drawing/2016/5/12/chartex" xmlns:cx7="http://schemas.microsoft.com/office/drawing/2016/5/13/chartex" xmlns:cx8="http://schemas.microsoft.com/office/drawing/2016/5/14/chartex" xmlns:mc="http://schemas.openxmlformats.org/markup-compatibility/2006" xmlns:aink="http://schemas.microsoft.com/office/drawing/2016/ink" xmlns:am3d="http://schemas.microsoft.com/office/drawing/2017/model3d" xmlns:o="urn:schemas-microsoft-com:office:office" xmlns:oel="http://schemas.microsoft.com/office/2019/extlst" xmlns:r="http://schemas.openxmlformats.org/officeDocument/2006/relationships" xmlns:m="http://schemas.openxmlformats.org/officeDocument/2006/math" xmlns:v="urn:schemas-microsoft-com:vml" xmlns:wp14="http://schemas.microsoft.com/office/word/2010/wordprocessingDrawing" xmlns:wp="http://schemas.openxmlformats.org/drawingml/2006/wordprocessingDrawing" xmlns:w10="urn:schemas-microsoft-com:office:word" xmlns:w="http://schemas.openxmlformats.org/wordprocessingml/2006/main" xmlns:w14="http://schemas.microsoft.com/office/word/2010/wordml" xmlns:w15="http://schemas.microsoft.com/office/word/2012/wordml" xmlns:w16cex="http://schemas.microsoft.com/office/word/2018/wordml/cex" xmlns:w16cid="http://schemas.microsoft.com/office/word/2016/wordml/cid" xmlns:w16="http://schemas.microsoft.com/office/word/2018/wordml" xmlns:w16du="http://schemas.microsoft.com/office/word/2023/wordml/word16du" xmlns:w16sdtdh="http://schemas.microsoft.com/office/word/2020/wordml/sdtdatahash" xmlns:w16sdtfl="http://schemas.microsoft.com/office/word/2024/wordml/sdtformatlock" xmlns:w16se="http://schemas.microsoft.com/office/word/2015/wordml/symex" xmlns:wpg="http://schemas.microsoft.com/office/word/2010/wordprocessingGroup" xmlns:wpi="http://schemas.microsoft.com/office/word/2010/wordprocessingInk" xmlns:wne="http://schemas.microsoft.com/office/word/2006/wordml" xmlns:wps="http://schemas.microsoft.com/office/word/2010/wordprocessingShape" mc:Ignorable="w14 w15 w16se w16cid w16 w16cex w16sdtdh w16sdtfl w16du wp14">
-  <w:p/>
+  <w:p>
+    <w:pPr>
+      <w:pStyle w:val="a9"/>
+    </w:pPr>
+  </w:p>
 </w:ftr>
 </file>
 
@@ -11219,13 +11276,25 @@
   </w:style>
   <w:style w:type="paragraph" w:customStyle="1" w:styleId="11">
     <w:name w:val="ГОСТ Заголовок 1"/>
-    <w:basedOn w:val="1"/>
+    <w:basedOn w:val="a"/>
     <w:next w:val="a5"/>
     <w:link w:val="12"/>
     <w:qFormat/>
     <w:rsid w:val="00E40463"/>
+    <w:pPr>
+      <w:keepNext/>
+      <w:keepLines/>
+      <w:pageBreakBefore/>
+      <w:spacing w:after="120"/>
+      <w:ind w:firstLine="0"/>
+      <w:jc w:val="center"/>
+      <w:outlineLvl w:val="0"/>
+    </w:pPr>
     <w:rPr>
-      <w:rFonts w:ascii="Times New Roman" w:eastAsia="Times New Roman" w:hAnsi="Times New Roman" w:cs="Times New Roman"/>
+      <w:rFonts w:cs="Times New Roman"/>
+      <w:b/>
+      <w:color w:val="000000"/>
+      <w:sz w:val="40"/>
     </w:rPr>
   </w:style>
   <w:style w:type="character" w:customStyle="1" w:styleId="a6">
@@ -11240,16 +11309,24 @@
   </w:style>
   <w:style w:type="paragraph" w:customStyle="1" w:styleId="21">
     <w:name w:val="ГОСТ Заголовок 2"/>
-    <w:basedOn w:val="2"/>
+    <w:basedOn w:val="a"/>
     <w:next w:val="a5"/>
     <w:link w:val="22"/>
     <w:qFormat/>
     <w:rsid w:val="00E40463"/>
     <w:pPr>
-      <w:ind w:right="0"/>
+      <w:keepNext/>
+      <w:keepLines/>
+      <w:spacing w:after="120"/>
+      <w:ind w:firstLine="0"/>
+      <w:jc w:val="left"/>
+      <w:outlineLvl w:val="1"/>
     </w:pPr>
     <w:rPr>
       <w:rFonts w:cs="Times New Roman"/>
+      <w:b/>
+      <w:color w:val="000000"/>
+      <w:sz w:val="36"/>
     </w:rPr>
   </w:style>
   <w:style w:type="character" w:customStyle="1" w:styleId="12">
@@ -11267,13 +11344,24 @@
   </w:style>
   <w:style w:type="paragraph" w:customStyle="1" w:styleId="31">
     <w:name w:val="ГОСТ Заголовок 3"/>
-    <w:basedOn w:val="3"/>
+    <w:basedOn w:val="a"/>
     <w:next w:val="a5"/>
     <w:link w:val="32"/>
     <w:qFormat/>
     <w:rsid w:val="00E40463"/>
+    <w:pPr>
+      <w:keepNext/>
+      <w:keepLines/>
+      <w:spacing w:after="120"/>
+      <w:ind w:firstLine="0"/>
+      <w:jc w:val="left"/>
+      <w:outlineLvl w:val="2"/>
+    </w:pPr>
     <w:rPr>
-      <w:rFonts w:eastAsia="Times New Roman" w:cs="Times New Roman"/>
+      <w:rFonts w:cs="Times New Roman"/>
+      <w:b/>
+      <w:color w:val="000000"/>
+      <w:sz w:val="32"/>
     </w:rPr>
   </w:style>
   <w:style w:type="character" w:customStyle="1" w:styleId="22">

</xml_diff>